<commit_message>
Humanise the prose of the research proposal
Rewrite the abstract and Chapters One to Three in plainer, more natural
academic English with varied sentence rhythm and fewer stock phrases.
Facts, citations, tables and structure are unchanged.

Co-Authored-By: Claude Opus 5.5 <noreply@anthropic.com>
Claude-Session: https://claude.ai/code/session_01PNTLWMjWixUAScuxPhmv5A
</commit_message>
<xml_diff>
--- a/Research_Proposal_Public_Participation_Machakos.docx
+++ b/Research_Proposal_Public_Participation_Machakos.docx
@@ -194,7 +194,7 @@
         <w:jc w:val="center"/>
         <w:rPr/>
       </w:pPr>
-      <w:bookmarkStart w:id="0" w:name="__RefHeading___Toc1372_3754024237"/>
+      <w:bookmarkStart w:id="0" w:name="__RefHeading___Toc1372_1996925461"/>
       <w:bookmarkEnd w:id="0"/>
       <w:r>
         <w:rPr/>
@@ -358,7 +358,7 @@
         <w:jc w:val="center"/>
         <w:rPr/>
       </w:pPr>
-      <w:bookmarkStart w:id="1" w:name="__RefHeading___Toc1374_3754024237"/>
+      <w:bookmarkStart w:id="1" w:name="__RefHeading___Toc1374_1996925461"/>
       <w:bookmarkEnd w:id="1"/>
       <w:r>
         <w:rPr/>
@@ -387,7 +387,7 @@
         <w:jc w:val="center"/>
         <w:rPr/>
       </w:pPr>
-      <w:bookmarkStart w:id="2" w:name="__RefHeading___Toc1376_3754024237"/>
+      <w:bookmarkStart w:id="2" w:name="__RefHeading___Toc1376_1996925461"/>
       <w:bookmarkEnd w:id="2"/>
       <w:r>
         <w:rPr/>
@@ -416,7 +416,7 @@
         <w:jc w:val="center"/>
         <w:rPr/>
       </w:pPr>
-      <w:bookmarkStart w:id="3" w:name="__RefHeading___Toc1378_3754024237"/>
+      <w:bookmarkStart w:id="3" w:name="__RefHeading___Toc1378_1996925461"/>
       <w:bookmarkEnd w:id="3"/>
       <w:r>
         <w:rPr/>
@@ -455,7 +455,7 @@
             </w:rPr>
             <w:fldChar w:fldCharType="separate"/>
           </w:r>
-          <w:hyperlink w:anchor="__RefHeading___Toc1372_3754024237">
+          <w:hyperlink w:anchor="__RefHeading___Toc1372_1996925461">
             <w:r>
               <w:rPr>
                 <w:rStyle w:val="IndexLink"/>
@@ -475,7 +475,7 @@
             </w:tabs>
             <w:rPr/>
           </w:pPr>
-          <w:hyperlink w:anchor="__RefHeading___Toc1374_3754024237">
+          <w:hyperlink w:anchor="__RefHeading___Toc1374_1996925461">
             <w:r>
               <w:rPr>
                 <w:rStyle w:val="IndexLink"/>
@@ -495,7 +495,7 @@
             </w:tabs>
             <w:rPr/>
           </w:pPr>
-          <w:hyperlink w:anchor="__RefHeading___Toc1376_3754024237">
+          <w:hyperlink w:anchor="__RefHeading___Toc1376_1996925461">
             <w:r>
               <w:rPr>
                 <w:rStyle w:val="IndexLink"/>
@@ -515,7 +515,7 @@
             </w:tabs>
             <w:rPr/>
           </w:pPr>
-          <w:hyperlink w:anchor="__RefHeading___Toc1378_3754024237">
+          <w:hyperlink w:anchor="__RefHeading___Toc1378_1996925461">
             <w:r>
               <w:rPr>
                 <w:rStyle w:val="IndexLink"/>
@@ -535,7 +535,7 @@
             </w:tabs>
             <w:rPr/>
           </w:pPr>
-          <w:hyperlink w:anchor="__RefHeading___Toc1380_3754024237">
+          <w:hyperlink w:anchor="__RefHeading___Toc1380_1996925461">
             <w:r>
               <w:rPr>
                 <w:rStyle w:val="IndexLink"/>
@@ -555,7 +555,7 @@
             </w:tabs>
             <w:rPr/>
           </w:pPr>
-          <w:hyperlink w:anchor="__RefHeading___Toc1382_3754024237">
+          <w:hyperlink w:anchor="__RefHeading___Toc1382_1996925461">
             <w:r>
               <w:rPr>
                 <w:rStyle w:val="IndexLink"/>
@@ -575,7 +575,7 @@
             </w:tabs>
             <w:rPr/>
           </w:pPr>
-          <w:hyperlink w:anchor="__RefHeading___Toc1384_3754024237">
+          <w:hyperlink w:anchor="__RefHeading___Toc1384_1996925461">
             <w:r>
               <w:rPr>
                 <w:rStyle w:val="IndexLink"/>
@@ -595,7 +595,7 @@
             </w:tabs>
             <w:rPr/>
           </w:pPr>
-          <w:hyperlink w:anchor="__RefHeading___Toc1386_3754024237">
+          <w:hyperlink w:anchor="__RefHeading___Toc1386_1996925461">
             <w:r>
               <w:rPr>
                 <w:rStyle w:val="IndexLink"/>
@@ -615,7 +615,7 @@
             </w:tabs>
             <w:rPr/>
           </w:pPr>
-          <w:hyperlink w:anchor="__RefHeading___Toc1388_3754024237">
+          <w:hyperlink w:anchor="__RefHeading___Toc1388_1996925461">
             <w:r>
               <w:rPr>
                 <w:rStyle w:val="IndexLink"/>
@@ -635,7 +635,7 @@
             </w:tabs>
             <w:rPr/>
           </w:pPr>
-          <w:hyperlink w:anchor="__RefHeading___Toc1390_3754024237">
+          <w:hyperlink w:anchor="__RefHeading___Toc1390_1996925461">
             <w:r>
               <w:rPr>
                 <w:rStyle w:val="IndexLink"/>
@@ -655,7 +655,7 @@
             </w:tabs>
             <w:rPr/>
           </w:pPr>
-          <w:hyperlink w:anchor="__RefHeading___Toc1392_3754024237">
+          <w:hyperlink w:anchor="__RefHeading___Toc1392_1996925461">
             <w:r>
               <w:rPr>
                 <w:rStyle w:val="IndexLink"/>
@@ -675,7 +675,7 @@
             </w:tabs>
             <w:rPr/>
           </w:pPr>
-          <w:hyperlink w:anchor="__RefHeading___Toc1394_3754024237">
+          <w:hyperlink w:anchor="__RefHeading___Toc1394_1996925461">
             <w:r>
               <w:rPr>
                 <w:rStyle w:val="IndexLink"/>
@@ -695,14 +695,14 @@
             </w:tabs>
             <w:rPr/>
           </w:pPr>
-          <w:hyperlink w:anchor="__RefHeading___Toc1396_3754024237">
+          <w:hyperlink w:anchor="__RefHeading___Toc1396_1996925461">
             <w:r>
               <w:rPr>
                 <w:rStyle w:val="IndexLink"/>
               </w:rPr>
               <w:t>1.3 Purpose of the Study</w:t>
               <w:tab/>
-              <w:t>4</w:t>
+              <w:t>3</w:t>
             </w:r>
           </w:hyperlink>
         </w:p>
@@ -715,7 +715,7 @@
             </w:tabs>
             <w:rPr/>
           </w:pPr>
-          <w:hyperlink w:anchor="__RefHeading___Toc1398_3754024237">
+          <w:hyperlink w:anchor="__RefHeading___Toc1398_1996925461">
             <w:r>
               <w:rPr>
                 <w:rStyle w:val="IndexLink"/>
@@ -735,7 +735,7 @@
             </w:tabs>
             <w:rPr/>
           </w:pPr>
-          <w:hyperlink w:anchor="__RefHeading___Toc1400_3754024237">
+          <w:hyperlink w:anchor="__RefHeading___Toc1400_1996925461">
             <w:r>
               <w:rPr>
                 <w:rStyle w:val="IndexLink"/>
@@ -755,7 +755,7 @@
             </w:tabs>
             <w:rPr/>
           </w:pPr>
-          <w:hyperlink w:anchor="__RefHeading___Toc1402_3754024237">
+          <w:hyperlink w:anchor="__RefHeading___Toc1402_1996925461">
             <w:r>
               <w:rPr>
                 <w:rStyle w:val="IndexLink"/>
@@ -775,7 +775,7 @@
             </w:tabs>
             <w:rPr/>
           </w:pPr>
-          <w:hyperlink w:anchor="__RefHeading___Toc1404_3754024237">
+          <w:hyperlink w:anchor="__RefHeading___Toc1404_1996925461">
             <w:r>
               <w:rPr>
                 <w:rStyle w:val="IndexLink"/>
@@ -795,14 +795,14 @@
             </w:tabs>
             <w:rPr/>
           </w:pPr>
-          <w:hyperlink w:anchor="__RefHeading___Toc1406_3754024237">
+          <w:hyperlink w:anchor="__RefHeading___Toc1406_1996925461">
             <w:r>
               <w:rPr>
                 <w:rStyle w:val="IndexLink"/>
               </w:rPr>
               <w:t>1.6 Research Hypothesis</w:t>
               <w:tab/>
-              <w:t>5</w:t>
+              <w:t>4</w:t>
             </w:r>
           </w:hyperlink>
         </w:p>
@@ -815,7 +815,7 @@
             </w:tabs>
             <w:rPr/>
           </w:pPr>
-          <w:hyperlink w:anchor="__RefHeading___Toc1408_3754024237">
+          <w:hyperlink w:anchor="__RefHeading___Toc1408_1996925461">
             <w:r>
               <w:rPr>
                 <w:rStyle w:val="IndexLink"/>
@@ -835,7 +835,7 @@
             </w:tabs>
             <w:rPr/>
           </w:pPr>
-          <w:hyperlink w:anchor="__RefHeading___Toc1410_3754024237">
+          <w:hyperlink w:anchor="__RefHeading___Toc1410_1996925461">
             <w:r>
               <w:rPr>
                 <w:rStyle w:val="IndexLink"/>
@@ -855,14 +855,14 @@
             </w:tabs>
             <w:rPr/>
           </w:pPr>
-          <w:hyperlink w:anchor="__RefHeading___Toc1412_3754024237">
+          <w:hyperlink w:anchor="__RefHeading___Toc1412_1996925461">
             <w:r>
               <w:rPr>
                 <w:rStyle w:val="IndexLink"/>
               </w:rPr>
               <w:t>1.9 Limitations of the Study</w:t>
               <w:tab/>
-              <w:t>6</w:t>
+              <w:t>5</w:t>
             </w:r>
           </w:hyperlink>
         </w:p>
@@ -875,7 +875,7 @@
             </w:tabs>
             <w:rPr/>
           </w:pPr>
-          <w:hyperlink w:anchor="__RefHeading___Toc1414_3754024237">
+          <w:hyperlink w:anchor="__RefHeading___Toc1414_1996925461">
             <w:r>
               <w:rPr>
                 <w:rStyle w:val="IndexLink"/>
@@ -895,7 +895,7 @@
             </w:tabs>
             <w:rPr/>
           </w:pPr>
-          <w:hyperlink w:anchor="__RefHeading___Toc1416_3754024237">
+          <w:hyperlink w:anchor="__RefHeading___Toc1416_1996925461">
             <w:r>
               <w:rPr>
                 <w:rStyle w:val="IndexLink"/>
@@ -915,7 +915,7 @@
             </w:tabs>
             <w:rPr/>
           </w:pPr>
-          <w:hyperlink w:anchor="__RefHeading___Toc1418_3754024237">
+          <w:hyperlink w:anchor="__RefHeading___Toc1418_1996925461">
             <w:r>
               <w:rPr>
                 <w:rStyle w:val="IndexLink"/>
@@ -935,7 +935,7 @@
             </w:tabs>
             <w:rPr/>
           </w:pPr>
-          <w:hyperlink w:anchor="__RefHeading___Toc1420_3754024237">
+          <w:hyperlink w:anchor="__RefHeading___Toc1420_1996925461">
             <w:r>
               <w:rPr>
                 <w:rStyle w:val="IndexLink"/>
@@ -955,7 +955,7 @@
             </w:tabs>
             <w:rPr/>
           </w:pPr>
-          <w:hyperlink w:anchor="__RefHeading___Toc1422_3754024237">
+          <w:hyperlink w:anchor="__RefHeading___Toc1422_1996925461">
             <w:r>
               <w:rPr>
                 <w:rStyle w:val="IndexLink"/>
@@ -975,7 +975,7 @@
             </w:tabs>
             <w:rPr/>
           </w:pPr>
-          <w:hyperlink w:anchor="__RefHeading___Toc1424_3754024237">
+          <w:hyperlink w:anchor="__RefHeading___Toc1424_1996925461">
             <w:r>
               <w:rPr>
                 <w:rStyle w:val="IndexLink"/>
@@ -995,14 +995,14 @@
             </w:tabs>
             <w:rPr/>
           </w:pPr>
-          <w:hyperlink w:anchor="__RefHeading___Toc1426_3754024237">
+          <w:hyperlink w:anchor="__RefHeading___Toc1426_1996925461">
             <w:r>
               <w:rPr>
                 <w:rStyle w:val="IndexLink"/>
               </w:rPr>
               <w:t>2.2.2 Theory of Co-production</w:t>
               <w:tab/>
-              <w:t>8</w:t>
+              <w:t>7</w:t>
             </w:r>
           </w:hyperlink>
         </w:p>
@@ -1015,7 +1015,7 @@
             </w:tabs>
             <w:rPr/>
           </w:pPr>
-          <w:hyperlink w:anchor="__RefHeading___Toc1428_3754024237">
+          <w:hyperlink w:anchor="__RefHeading___Toc1428_1996925461">
             <w:r>
               <w:rPr>
                 <w:rStyle w:val="IndexLink"/>
@@ -1035,7 +1035,7 @@
             </w:tabs>
             <w:rPr/>
           </w:pPr>
-          <w:hyperlink w:anchor="__RefHeading___Toc1430_3754024237">
+          <w:hyperlink w:anchor="__RefHeading___Toc1430_1996925461">
             <w:r>
               <w:rPr>
                 <w:rStyle w:val="IndexLink"/>
@@ -1055,7 +1055,7 @@
             </w:tabs>
             <w:rPr/>
           </w:pPr>
-          <w:hyperlink w:anchor="__RefHeading___Toc1432_3754024237">
+          <w:hyperlink w:anchor="__RefHeading___Toc1432_1996925461">
             <w:r>
               <w:rPr>
                 <w:rStyle w:val="IndexLink"/>
@@ -1075,14 +1075,14 @@
             </w:tabs>
             <w:rPr/>
           </w:pPr>
-          <w:hyperlink w:anchor="__RefHeading___Toc1434_3754024237">
+          <w:hyperlink w:anchor="__RefHeading___Toc1434_1996925461">
             <w:r>
               <w:rPr>
                 <w:rStyle w:val="IndexLink"/>
               </w:rPr>
               <w:t>2.3.3 Challenges Hindering Effective Public Participation</w:t>
               <w:tab/>
-              <w:t>10</w:t>
+              <w:t>9</w:t>
             </w:r>
           </w:hyperlink>
         </w:p>
@@ -1095,7 +1095,7 @@
             </w:tabs>
             <w:rPr/>
           </w:pPr>
-          <w:hyperlink w:anchor="__RefHeading___Toc1436_3754024237">
+          <w:hyperlink w:anchor="__RefHeading___Toc1436_1996925461">
             <w:r>
               <w:rPr>
                 <w:rStyle w:val="IndexLink"/>
@@ -1115,14 +1115,14 @@
             </w:tabs>
             <w:rPr/>
           </w:pPr>
-          <w:hyperlink w:anchor="__RefHeading___Toc1438_3754024237">
+          <w:hyperlink w:anchor="__RefHeading___Toc1438_1996925461">
             <w:r>
               <w:rPr>
                 <w:rStyle w:val="IndexLink"/>
               </w:rPr>
               <w:t>2.4 Conceptual Framework</w:t>
               <w:tab/>
-              <w:t>11</w:t>
+              <w:t>10</w:t>
             </w:r>
           </w:hyperlink>
         </w:p>
@@ -1135,14 +1135,14 @@
             </w:tabs>
             <w:rPr/>
           </w:pPr>
-          <w:hyperlink w:anchor="__RefHeading___Toc1440_3754024237">
+          <w:hyperlink w:anchor="__RefHeading___Toc1440_1996925461">
             <w:r>
               <w:rPr>
                 <w:rStyle w:val="IndexLink"/>
               </w:rPr>
               <w:t>2.5 Critique of Existing Literature</w:t>
               <w:tab/>
-              <w:t>12</w:t>
+              <w:t>11</w:t>
             </w:r>
           </w:hyperlink>
         </w:p>
@@ -1155,14 +1155,14 @@
             </w:tabs>
             <w:rPr/>
           </w:pPr>
-          <w:hyperlink w:anchor="__RefHeading___Toc1442_3754024237">
+          <w:hyperlink w:anchor="__RefHeading___Toc1442_1996925461">
             <w:r>
               <w:rPr>
                 <w:rStyle w:val="IndexLink"/>
               </w:rPr>
               <w:t>2.6 Summary of Literature and Research Gaps</w:t>
               <w:tab/>
-              <w:t>12</w:t>
+              <w:t>11</w:t>
             </w:r>
           </w:hyperlink>
         </w:p>
@@ -1175,14 +1175,14 @@
             </w:tabs>
             <w:rPr/>
           </w:pPr>
-          <w:hyperlink w:anchor="__RefHeading___Toc1444_3754024237">
+          <w:hyperlink w:anchor="__RefHeading___Toc1444_1996925461">
             <w:r>
               <w:rPr>
                 <w:rStyle w:val="IndexLink"/>
               </w:rPr>
               <w:t>CHAPTER THREE RESEARCH METHODOLOGY</w:t>
               <w:tab/>
-              <w:t>14</w:t>
+              <w:t>13</w:t>
             </w:r>
           </w:hyperlink>
         </w:p>
@@ -1195,14 +1195,14 @@
             </w:tabs>
             <w:rPr/>
           </w:pPr>
-          <w:hyperlink w:anchor="__RefHeading___Toc1446_3754024237">
+          <w:hyperlink w:anchor="__RefHeading___Toc1446_1996925461">
             <w:r>
               <w:rPr>
                 <w:rStyle w:val="IndexLink"/>
               </w:rPr>
               <w:t>3.1 Introduction</w:t>
               <w:tab/>
-              <w:t>14</w:t>
+              <w:t>13</w:t>
             </w:r>
           </w:hyperlink>
         </w:p>
@@ -1215,14 +1215,14 @@
             </w:tabs>
             <w:rPr/>
           </w:pPr>
-          <w:hyperlink w:anchor="__RefHeading___Toc1448_3754024237">
+          <w:hyperlink w:anchor="__RefHeading___Toc1448_1996925461">
             <w:r>
               <w:rPr>
                 <w:rStyle w:val="IndexLink"/>
               </w:rPr>
               <w:t>3.2 Research Design</w:t>
               <w:tab/>
-              <w:t>14</w:t>
+              <w:t>13</w:t>
             </w:r>
           </w:hyperlink>
         </w:p>
@@ -1235,14 +1235,14 @@
             </w:tabs>
             <w:rPr/>
           </w:pPr>
-          <w:hyperlink w:anchor="__RefHeading___Toc1450_3754024237">
+          <w:hyperlink w:anchor="__RefHeading___Toc1450_1996925461">
             <w:r>
               <w:rPr>
                 <w:rStyle w:val="IndexLink"/>
               </w:rPr>
               <w:t>3.3 Location of the Study</w:t>
               <w:tab/>
-              <w:t>14</w:t>
+              <w:t>13</w:t>
             </w:r>
           </w:hyperlink>
         </w:p>
@@ -1255,14 +1255,14 @@
             </w:tabs>
             <w:rPr/>
           </w:pPr>
-          <w:hyperlink w:anchor="__RefHeading___Toc1452_3754024237">
+          <w:hyperlink w:anchor="__RefHeading___Toc1452_1996925461">
             <w:r>
               <w:rPr>
                 <w:rStyle w:val="IndexLink"/>
               </w:rPr>
               <w:t>3.4 Target Population</w:t>
               <w:tab/>
-              <w:t>15</w:t>
+              <w:t>13</w:t>
             </w:r>
           </w:hyperlink>
         </w:p>
@@ -1275,14 +1275,14 @@
             </w:tabs>
             <w:rPr/>
           </w:pPr>
-          <w:hyperlink w:anchor="__RefHeading___Toc1454_3754024237">
+          <w:hyperlink w:anchor="__RefHeading___Toc1454_1996925461">
             <w:r>
               <w:rPr>
                 <w:rStyle w:val="IndexLink"/>
               </w:rPr>
               <w:t>3.5 Sampling Techniques and Sample Size</w:t>
               <w:tab/>
-              <w:t>15</w:t>
+              <w:t>14</w:t>
             </w:r>
           </w:hyperlink>
         </w:p>
@@ -1295,14 +1295,14 @@
             </w:tabs>
             <w:rPr/>
           </w:pPr>
-          <w:hyperlink w:anchor="__RefHeading___Toc1456_3754024237">
+          <w:hyperlink w:anchor="__RefHeading___Toc1456_1996925461">
             <w:r>
               <w:rPr>
                 <w:rStyle w:val="IndexLink"/>
               </w:rPr>
               <w:t>3.5.1 Sampling Techniques</w:t>
               <w:tab/>
-              <w:t>15</w:t>
+              <w:t>14</w:t>
             </w:r>
           </w:hyperlink>
         </w:p>
@@ -1315,14 +1315,14 @@
             </w:tabs>
             <w:rPr/>
           </w:pPr>
-          <w:hyperlink w:anchor="__RefHeading___Toc1458_3754024237">
+          <w:hyperlink w:anchor="__RefHeading___Toc1458_1996925461">
             <w:r>
               <w:rPr>
                 <w:rStyle w:val="IndexLink"/>
               </w:rPr>
               <w:t>3.5.2 Sample Size</w:t>
               <w:tab/>
-              <w:t>15</w:t>
+              <w:t>14</w:t>
             </w:r>
           </w:hyperlink>
         </w:p>
@@ -1335,14 +1335,14 @@
             </w:tabs>
             <w:rPr/>
           </w:pPr>
-          <w:hyperlink w:anchor="__RefHeading___Toc1460_3754024237">
+          <w:hyperlink w:anchor="__RefHeading___Toc1460_1996925461">
             <w:r>
               <w:rPr>
                 <w:rStyle w:val="IndexLink"/>
               </w:rPr>
               <w:t>3.6 Research Instruments</w:t>
               <w:tab/>
-              <w:t>16</w:t>
+              <w:t>15</w:t>
             </w:r>
           </w:hyperlink>
         </w:p>
@@ -1355,14 +1355,14 @@
             </w:tabs>
             <w:rPr/>
           </w:pPr>
-          <w:hyperlink w:anchor="__RefHeading___Toc1462_3754024237">
+          <w:hyperlink w:anchor="__RefHeading___Toc1462_1996925461">
             <w:r>
               <w:rPr>
                 <w:rStyle w:val="IndexLink"/>
               </w:rPr>
               <w:t>3.7 Pilot Testing</w:t>
               <w:tab/>
-              <w:t>17</w:t>
+              <w:t>16</w:t>
             </w:r>
           </w:hyperlink>
         </w:p>
@@ -1375,14 +1375,14 @@
             </w:tabs>
             <w:rPr/>
           </w:pPr>
-          <w:hyperlink w:anchor="__RefHeading___Toc1464_3754024237">
+          <w:hyperlink w:anchor="__RefHeading___Toc1464_1996925461">
             <w:r>
               <w:rPr>
                 <w:rStyle w:val="IndexLink"/>
               </w:rPr>
               <w:t>3.7.1 Validity of Research Instruments</w:t>
               <w:tab/>
-              <w:t>17</w:t>
+              <w:t>16</w:t>
             </w:r>
           </w:hyperlink>
         </w:p>
@@ -1395,14 +1395,14 @@
             </w:tabs>
             <w:rPr/>
           </w:pPr>
-          <w:hyperlink w:anchor="__RefHeading___Toc1466_3754024237">
+          <w:hyperlink w:anchor="__RefHeading___Toc1466_1996925461">
             <w:r>
               <w:rPr>
                 <w:rStyle w:val="IndexLink"/>
               </w:rPr>
               <w:t>3.7.2 Reliability of Research Instruments</w:t>
               <w:tab/>
-              <w:t>17</w:t>
+              <w:t>16</w:t>
             </w:r>
           </w:hyperlink>
         </w:p>
@@ -1415,14 +1415,14 @@
             </w:tabs>
             <w:rPr/>
           </w:pPr>
-          <w:hyperlink w:anchor="__RefHeading___Toc1468_3754024237">
+          <w:hyperlink w:anchor="__RefHeading___Toc1468_1996925461">
             <w:r>
               <w:rPr>
                 <w:rStyle w:val="IndexLink"/>
               </w:rPr>
               <w:t>3.8 Data Collection Procedures</w:t>
               <w:tab/>
-              <w:t>18</w:t>
+              <w:t>16</w:t>
             </w:r>
           </w:hyperlink>
         </w:p>
@@ -1435,14 +1435,14 @@
             </w:tabs>
             <w:rPr/>
           </w:pPr>
-          <w:hyperlink w:anchor="__RefHeading___Toc1470_3754024237">
+          <w:hyperlink w:anchor="__RefHeading___Toc1470_1996925461">
             <w:r>
               <w:rPr>
                 <w:rStyle w:val="IndexLink"/>
               </w:rPr>
               <w:t>3.9 Data Analysis and Presentation</w:t>
               <w:tab/>
-              <w:t>18</w:t>
+              <w:t>17</w:t>
             </w:r>
           </w:hyperlink>
         </w:p>
@@ -1455,14 +1455,14 @@
             </w:tabs>
             <w:rPr/>
           </w:pPr>
-          <w:hyperlink w:anchor="__RefHeading___Toc1472_3754024237">
+          <w:hyperlink w:anchor="__RefHeading___Toc1472_1996925461">
             <w:r>
               <w:rPr>
                 <w:rStyle w:val="IndexLink"/>
               </w:rPr>
               <w:t>3.10 Ethical Considerations</w:t>
               <w:tab/>
-              <w:t>19</w:t>
+              <w:t>17</w:t>
             </w:r>
           </w:hyperlink>
         </w:p>
@@ -1475,14 +1475,14 @@
             </w:tabs>
             <w:rPr/>
           </w:pPr>
-          <w:hyperlink w:anchor="__RefHeading___Toc1474_3754024237">
+          <w:hyperlink w:anchor="__RefHeading___Toc1474_1996925461">
             <w:r>
               <w:rPr>
                 <w:rStyle w:val="IndexLink"/>
               </w:rPr>
               <w:t>REFERENCES</w:t>
               <w:tab/>
-              <w:t>20</w:t>
+              <w:t>19</w:t>
             </w:r>
           </w:hyperlink>
         </w:p>
@@ -1495,14 +1495,14 @@
             </w:tabs>
             <w:rPr/>
           </w:pPr>
-          <w:hyperlink w:anchor="__RefHeading___Toc1476_3754024237">
+          <w:hyperlink w:anchor="__RefHeading___Toc1476_1996925461">
             <w:r>
               <w:rPr>
                 <w:rStyle w:val="IndexLink"/>
               </w:rPr>
               <w:t>APPENDICES</w:t>
               <w:tab/>
-              <w:t>24</w:t>
+              <w:t>23</w:t>
             </w:r>
           </w:hyperlink>
         </w:p>
@@ -1515,14 +1515,14 @@
             </w:tabs>
             <w:rPr/>
           </w:pPr>
-          <w:hyperlink w:anchor="__RefHeading___Toc1478_3754024237">
+          <w:hyperlink w:anchor="__RefHeading___Toc1478_1996925461">
             <w:r>
               <w:rPr>
                 <w:rStyle w:val="IndexLink"/>
               </w:rPr>
               <w:t>Appendix I: Letter of Introduction</w:t>
               <w:tab/>
-              <w:t>24</w:t>
+              <w:t>23</w:t>
             </w:r>
           </w:hyperlink>
         </w:p>
@@ -1535,14 +1535,14 @@
             </w:tabs>
             <w:rPr/>
           </w:pPr>
-          <w:hyperlink w:anchor="__RefHeading___Toc1480_3754024237">
+          <w:hyperlink w:anchor="__RefHeading___Toc1480_1996925461">
             <w:r>
               <w:rPr>
                 <w:rStyle w:val="IndexLink"/>
               </w:rPr>
               <w:t>Appendix II: Informed Consent Form</w:t>
               <w:tab/>
-              <w:t>25</w:t>
+              <w:t>24</w:t>
             </w:r>
           </w:hyperlink>
         </w:p>
@@ -1555,14 +1555,14 @@
             </w:tabs>
             <w:rPr/>
           </w:pPr>
-          <w:hyperlink w:anchor="__RefHeading___Toc1482_3754024237">
+          <w:hyperlink w:anchor="__RefHeading___Toc1482_1996925461">
             <w:r>
               <w:rPr>
                 <w:rStyle w:val="IndexLink"/>
               </w:rPr>
               <w:t>Appendix III: Questionnaire for Residents</w:t>
               <w:tab/>
-              <w:t>26</w:t>
+              <w:t>25</w:t>
             </w:r>
           </w:hyperlink>
         </w:p>
@@ -1575,14 +1575,14 @@
             </w:tabs>
             <w:rPr/>
           </w:pPr>
-          <w:hyperlink w:anchor="__RefHeading___Toc1484_3754024237">
+          <w:hyperlink w:anchor="__RefHeading___Toc1484_1996925461">
             <w:r>
               <w:rPr>
                 <w:rStyle w:val="IndexLink"/>
               </w:rPr>
               <w:t>Section A: Demographic Information</w:t>
               <w:tab/>
-              <w:t>26</w:t>
+              <w:t>25</w:t>
             </w:r>
           </w:hyperlink>
         </w:p>
@@ -1595,14 +1595,14 @@
             </w:tabs>
             <w:rPr/>
           </w:pPr>
-          <w:hyperlink w:anchor="__RefHeading___Toc1486_3754024237">
+          <w:hyperlink w:anchor="__RefHeading___Toc1486_1996925461">
             <w:r>
               <w:rPr>
                 <w:rStyle w:val="IndexLink"/>
               </w:rPr>
               <w:t>Section B: Extent of Public Participation in Policy Implementation</w:t>
               <w:tab/>
-              <w:t>26</w:t>
+              <w:t>25</w:t>
             </w:r>
           </w:hyperlink>
         </w:p>
@@ -1615,14 +1615,14 @@
             </w:tabs>
             <w:rPr/>
           </w:pPr>
-          <w:hyperlink w:anchor="__RefHeading___Toc1488_3754024237">
+          <w:hyperlink w:anchor="__RefHeading___Toc1488_1996925461">
             <w:r>
               <w:rPr>
                 <w:rStyle w:val="IndexLink"/>
               </w:rPr>
               <w:t>Section C: Mechanisms for Facilitating Public Participation</w:t>
               <w:tab/>
-              <w:t>26</w:t>
+              <w:t>25</w:t>
             </w:r>
           </w:hyperlink>
         </w:p>
@@ -1635,14 +1635,14 @@
             </w:tabs>
             <w:rPr/>
           </w:pPr>
-          <w:hyperlink w:anchor="__RefHeading___Toc1490_3754024237">
+          <w:hyperlink w:anchor="__RefHeading___Toc1490_1996925461">
             <w:r>
               <w:rPr>
                 <w:rStyle w:val="IndexLink"/>
               </w:rPr>
               <w:t>Section D: Challenges Hindering Public Participation</w:t>
               <w:tab/>
-              <w:t>27</w:t>
+              <w:t>26</w:t>
             </w:r>
           </w:hyperlink>
         </w:p>
@@ -1655,14 +1655,14 @@
             </w:tabs>
             <w:rPr/>
           </w:pPr>
-          <w:hyperlink w:anchor="__RefHeading___Toc1492_3754024237">
+          <w:hyperlink w:anchor="__RefHeading___Toc1492_1996925461">
             <w:r>
               <w:rPr>
                 <w:rStyle w:val="IndexLink"/>
               </w:rPr>
               <w:t>Section E: Effectiveness of Policy Implementation</w:t>
               <w:tab/>
-              <w:t>27</w:t>
+              <w:t>26</w:t>
             </w:r>
           </w:hyperlink>
         </w:p>
@@ -1675,14 +1675,14 @@
             </w:tabs>
             <w:rPr/>
           </w:pPr>
-          <w:hyperlink w:anchor="__RefHeading___Toc1494_3754024237">
+          <w:hyperlink w:anchor="__RefHeading___Toc1494_1996925461">
             <w:r>
               <w:rPr>
                 <w:rStyle w:val="IndexLink"/>
               </w:rPr>
               <w:t>Section F: General Comments</w:t>
               <w:tab/>
-              <w:t>28</w:t>
+              <w:t>27</w:t>
             </w:r>
           </w:hyperlink>
         </w:p>
@@ -1695,14 +1695,14 @@
             </w:tabs>
             <w:rPr/>
           </w:pPr>
-          <w:hyperlink w:anchor="__RefHeading___Toc1496_3754024237">
+          <w:hyperlink w:anchor="__RefHeading___Toc1496_1996925461">
             <w:r>
               <w:rPr>
                 <w:rStyle w:val="IndexLink"/>
               </w:rPr>
               <w:t>Appendix IV: Interview Guide for Key Informants</w:t>
               <w:tab/>
-              <w:t>29</w:t>
+              <w:t>28</w:t>
             </w:r>
           </w:hyperlink>
         </w:p>
@@ -1715,14 +1715,14 @@
             </w:tabs>
             <w:rPr/>
           </w:pPr>
-          <w:hyperlink w:anchor="__RefHeading___Toc1498_3754024237">
+          <w:hyperlink w:anchor="__RefHeading___Toc1498_1996925461">
             <w:r>
               <w:rPr>
                 <w:rStyle w:val="IndexLink"/>
               </w:rPr>
               <w:t>Appendix V: Work Plan</w:t>
               <w:tab/>
-              <w:t>30</w:t>
+              <w:t>29</w:t>
             </w:r>
           </w:hyperlink>
         </w:p>
@@ -1735,14 +1735,14 @@
             </w:tabs>
             <w:rPr/>
           </w:pPr>
-          <w:hyperlink w:anchor="__RefHeading___Toc1500_3754024237">
+          <w:hyperlink w:anchor="__RefHeading___Toc1500_1996925461">
             <w:r>
               <w:rPr>
                 <w:rStyle w:val="IndexLink"/>
               </w:rPr>
               <w:t>Appendix VI: Research Budget</w:t>
               <w:tab/>
-              <w:t>30</w:t>
+              <w:t>29</w:t>
             </w:r>
           </w:hyperlink>
           <w:r>
@@ -1777,7 +1777,7 @@
         <w:jc w:val="center"/>
         <w:rPr/>
       </w:pPr>
-      <w:bookmarkStart w:id="4" w:name="__RefHeading___Toc1380_3754024237"/>
+      <w:bookmarkStart w:id="4" w:name="__RefHeading___Toc1380_1996925461"/>
       <w:bookmarkEnd w:id="4"/>
       <w:r>
         <w:rPr/>
@@ -1854,7 +1854,7 @@
         <w:jc w:val="center"/>
         <w:rPr/>
       </w:pPr>
-      <w:bookmarkStart w:id="5" w:name="__RefHeading___Toc1382_3754024237"/>
+      <w:bookmarkStart w:id="5" w:name="__RefHeading___Toc1382_1996925461"/>
       <w:bookmarkEnd w:id="5"/>
       <w:r>
         <w:rPr/>
@@ -1883,7 +1883,7 @@
         <w:jc w:val="center"/>
         <w:rPr/>
       </w:pPr>
-      <w:bookmarkStart w:id="6" w:name="__RefHeading___Toc1384_3754024237"/>
+      <w:bookmarkStart w:id="6" w:name="__RefHeading___Toc1384_1996925461"/>
       <w:bookmarkEnd w:id="6"/>
       <w:r>
         <w:rPr/>
@@ -2398,7 +2398,7 @@
       <w:r>
         <w:br w:type="page"/>
       </w:r>
-      <w:bookmarkStart w:id="7" w:name="__RefHeading___Toc1386_3754024237"/>
+      <w:bookmarkStart w:id="7" w:name="__RefHeading___Toc1386_1996925461"/>
       <w:bookmarkEnd w:id="7"/>
       <w:r>
         <w:rPr/>
@@ -2548,7 +2548,7 @@
         <w:jc w:val="center"/>
         <w:rPr/>
       </w:pPr>
-      <w:bookmarkStart w:id="8" w:name="__RefHeading___Toc1388_3754024237"/>
+      <w:bookmarkStart w:id="8" w:name="__RefHeading___Toc1388_1996925461"/>
       <w:bookmarkEnd w:id="8"/>
       <w:r>
         <w:rPr/>
@@ -2564,7 +2564,7 @@
       </w:pPr>
       <w:r>
         <w:rPr/>
-        <w:t>Kenya's 2010 Constitution placed citizens at the centre of devolved governance, yet many county policies continue to stall, overrun their timelines or fall short of their targets once they leave the planning table. Much of the existing Kenyan scholarship has examined public participation at the planning and budgeting stages, leaving the implementation stage comparatively under-examined. This study therefore seeks to examine the influence of public participation on policy implementation in the Machakos County Government. Specifically, it aims to establish the extent to which residents participate in the implementation of county policies, assess the mechanisms the county uses to facilitate that participation, determine the challenges that constrain it, and examine the relationship between the level of participation and the effectiveness of policy implementation. The study is anchored on Arnstein's Ladder of Citizen Participation and the Theory of Co-production. A descriptive cross-sectional survey design, complemented by key informant interviews, will be adopted. The target population comprises 514,059 residents of Machakos Town, Matungulu and Mwala sub-counties, chosen to represent urban, peri-urban and rural settings, together with county officials responsible for participation and service delivery. Using Yamane's formula and proportionate stratified random sampling, 400 residents will be selected, while 29 key informants will be purposively sampled. Data will be collected through a structured questionnaire and a semi-structured interview guide, both of which will be pre-tested in Kathiani Sub-County. Quantitative data will be analysed using descriptive statistics, Pearson correlation and regression analysis in SPSS, whereas qualitative data will be analysed thematically. The findings are expected to guide the Machakos County Government, the Council of Governors and policy makers in strengthening participatory implementation, and to contribute to the growing literature on devolved governance in Kenya.</w:t>
+        <w:t>Kenya's 2010 Constitution promised citizens a real say in how they are governed, and devolution was meant to bring that promise closer to home. More than a decade later, many county policies still stall, run late or deliver less than was planned. Research on public participation in Kenya has mostly looked at planning and budgeting, and far less is known about what happens once a policy is approved and work begins on the ground. This study will examine how public participation influences policy implementation in the Machakos County Government. It will establish how far residents take part in implementing county policies, assess the channels the county uses to involve them, identify what stands in their way, and test whether higher participation goes hand in hand with better implementation. Arnstein's Ladder of Citizen Participation and the Theory of Co-production provide the theoretical lens. The study will use a descriptive cross-sectional survey supported by key informant interviews. It targets 514,059 residents of Machakos Town, Matungulu and Mwala sub-counties, which represent urban, peri-urban and rural settings, along with county officials involved in participation and service delivery. A sample of 400 residents will be drawn using Yamane's formula and proportionate stratified random sampling, and 29 key informants will be chosen purposively. A questionnaire and an interview guide, first pre-tested in Kathiani Sub-County, will be used to collect data. Quantitative data will be analysed in SPSS using descriptive statistics, correlation and regression, while interview data will be analysed thematically. The results should help the county government and other counties make participation count during implementation, and add Kenyan evidence to the study of devolved governance.</w:t>
       </w:r>
     </w:p>
     <w:p>
@@ -2608,7 +2608,7 @@
         <w:jc w:val="center"/>
         <w:rPr/>
       </w:pPr>
-      <w:bookmarkStart w:id="9" w:name="__RefHeading___Toc1390_3754024237"/>
+      <w:bookmarkStart w:id="9" w:name="__RefHeading___Toc1390_1996925461"/>
       <w:bookmarkEnd w:id="9"/>
       <w:r>
         <w:rPr/>
@@ -2623,7 +2623,7 @@
         <w:spacing w:lineRule="exact" w:line="360" w:before="240" w:after="120"/>
         <w:rPr/>
       </w:pPr>
-      <w:bookmarkStart w:id="10" w:name="__RefHeading___Toc1392_3754024237"/>
+      <w:bookmarkStart w:id="10" w:name="__RefHeading___Toc1392_1996925461"/>
       <w:bookmarkEnd w:id="10"/>
       <w:r>
         <w:rPr/>
@@ -2639,7 +2639,7 @@
       </w:pPr>
       <w:r>
         <w:rPr/>
-        <w:t>Across the world, governments have come to accept that policies designed without the people they are meant to serve seldom achieve their goals. Citizen participation is now widely treated as a condition for legitimate, responsive and effective public administration, and not merely as a democratic courtesy (Abas et al., 2023). The reasoning is straightforward. When residents are involved, public agencies gain local knowledge, policies are better matched to real needs, and communities are more willing to own and protect what is delivered (Loeffler &amp; Bovaird, 2021). The difficulty, however, lies less in agreeing with this principle than in making it work in the daily routines of government.</w:t>
+        <w:t>Governments everywhere have learnt, sometimes at great cost, that policies made without the people they affect rarely work as intended. Citizen participation is therefore now treated as part of good public administration, and it carries practical weight as well as democratic value (Abas et al., 2023). When residents are involved, officials gain local knowledge they would otherwise lack. Policies fit real needs more closely, and communities are more willing to look after what is built for them (Loeffler &amp; Bovaird, 2021). Few people dispute this in principle. The hard part is making it happen in the day-to-day work of government.</w:t>
       </w:r>
     </w:p>
     <w:p>
@@ -2651,7 +2651,7 @@
       </w:pPr>
       <w:r>
         <w:rPr/>
-        <w:t>Evidence from Europe illustrates this difficulty. In Finland, Jäntti et al. (2023) observed that embedding participation in local government requires changes at the strategic, executive and citizen-interface levels of an organisation, and that forums alone do little if they are disconnected from the offices that make and execute decisions. A companion study of the city of Helsinki showed that influential participation depends on supportive organisational structures, a receptive culture and adequate resources (Kurkela et al., 2024). In the Netherlands, De Weger et al. (2022) found that residents wanted their involvement in municipal health policy to produce visible changes in their neighbourhoods, and that they needed better communication and more accessible processes to stay engaged. Norwegian experience points in the same direction; Linstad et al. (2024) traced how an inclusive governance model was used over a decade to align stakeholder interests with national eHealth ambitions, showing that the influence of participation on implementation is built, and can be lost, over time.</w:t>
+        <w:t>Experience in Europe shows how hard that can be. Studying Finnish local government, Jäntti et al. (2023) found that participation only takes root when it reaches the strategic, executive and frontline levels of an organisation; forums that sit apart from the offices making and carrying out decisions achieve little. A related study in Helsinki traced influential participation to three things: supportive structures, a receptive organisational culture and enough resources (Kurkela et al., 2024). Dutch residents interviewed by De Weger et al. (2022) wanted their involvement in municipal health policy to change something visible in their neighbourhoods, and said they needed clearer communication and easier processes if they were to stay involved. In Norway, Linstad et al. (2024) followed an inclusive eHealth governance model over ten years and showed that stakeholder buy-in during implementation had to be built steadily, and could just as easily be lost.</w:t>
       </w:r>
     </w:p>
     <w:p>
@@ -2663,7 +2663,7 @@
       </w:pPr>
       <w:r>
         <w:rPr/>
-        <w:t>The link between participation and outcomes is also debated. A Norwegian study reported that municipal efforts to widen participation had very limited effect on trust in local politicians and no measurable effect on actual participation (Holum, 2023). In Argentina, informing voters about a participatory budgeting programme improved their view of government performance only marginally (Ardanaz et al., 2023), and a vignette experiment in South Korea produced a similarly modest effect of participatory policymaking on trust (Campbell, 2023). These findings caution against assuming that more participation automatically yields better results. What seems to matter is whether citizens can see that their input changed what government actually did.</w:t>
+        <w:t>Whether participation actually improves outcomes is still debated. In Norwegian municipalities, efforts to widen participation did little for trust in local politicians and nothing measurable for turnout (Holum, 2023). Telling voters in Buenos Aires about a participatory budgeting programme nudged their opinion of government only slightly (Ardanaz et al., 2023), and a vignette experiment in South Korea found a similarly small effect (Campbell, 2023). None of this means participation is pointless. It suggests that people judge participation by its results, and that they need to see their input change what government does.</w:t>
       </w:r>
     </w:p>
     <w:p>
@@ -2675,7 +2675,7 @@
       </w:pPr>
       <w:r>
         <w:rPr/>
-        <w:t>In Africa, decentralisation reforms have multiplied the formal spaces for citizen engagement, but their performance has been uneven. In Uganda, Mukiga et al. (2024) found that the absence of a formalised structure, such as a functioning health committee, weakened citizens' ability to shape local health services. In Mogadishu, Somalia, public participation was found to raise residents' trust in local government, partly because it made the city administration appear more responsive (Abdi et al., 2025). The continental picture, therefore, is one where participation holds promise but depends heavily on the institutions that surround it.</w:t>
+        <w:t>African decentralisation reforms have opened many new spaces for citizens, with mixed results. In Uganda, Mukiga et al. (2024) found that residents had little influence on local health services, partly because there was no functioning health committee through which to channel their views. In Mogadishu, on the other hand, residents who took part in local affairs trusted the city administration more, largely because they saw it as more responsive (Abdi et al., 2025). The lesson from the continent is that participation can work, but only where the surrounding institutions allow it to.</w:t>
       </w:r>
     </w:p>
     <w:p>
@@ -2687,7 +2687,7 @@
       </w:pPr>
       <w:r>
         <w:rPr/>
-        <w:t>Kenya offers a particularly instructive case. The Constitution of Kenya (2010) lists public participation among the national values and principles of governance under Article 10(2)(a) and names the empowerment of citizens as an object of devolution under Article 174(c). The County Governments Act (2012) and the Public Finance Management Act (2012) require counties to create structures through which residents can take part in planning, budgeting and oversight. More recently, the national government adopted the Kenya Policy on Public Participation as Sessional Paper No. 3 of 2023 to harmonise practice across both levels of government (Republic of Kenya, 2023), and Parliament has been considering the Public Participation Bill, 2025, which seeks to set uniform standards for how participation is conducted (Republic of Kenya, 2025). Kenya therefore does not lack a legal basis for participation. What remains uncertain is whether that legal basis translates into real influence once policies move from paper to practice.</w:t>
+        <w:t>Kenya is a useful case in this regard. Article 10(2)(a) of the Constitution of Kenya (2010) lists public participation among the national values of governance, and Article 174(c) names citizen empowerment as one of the objects of devolution. The County Governments Act (2012) and the Public Finance Management Act (2012) go further and require counties to build structures through which residents can shape plans and budgets. In 2023 the national government adopted the Kenya Policy on Public Participation as Sessional Paper No. 3 of 2023 to bring some consistency to practice (Republic of Kenya, 2023), and the Public Participation Bill, 2025 now seeks to set common standards in law (Republic of Kenya, 2025). The legal foundation, then, is solid. The open question is whether it gives citizens real influence once policies leave the drafting table.</w:t>
       </w:r>
     </w:p>
     <w:p>
@@ -2699,7 +2699,7 @@
       </w:pPr>
       <w:r>
         <w:rPr/>
-        <w:t>Empirical work in Kenyan counties suggests that the translation is incomplete. In Bungoma County, public participation was found to influence governance and, through it, sustainable development (Hao et al., 2022). In Kericho County, residents took part in budget preparation, public forums, scrutiny of records and the election of project leaders, but their overall participation across these modes was low (Ngeno et al., 2023). Studies in Laikipia County and across the 47 counties show that the choice of communication channel strongly shapes who attends and who is left out (Wambugu et al., 2024; Wasike et al., 2024). At the national level, citizens' awareness of the Finance Act, 2023 was high, yet very few took part actively in its consideration, and most respondents judged the channels used, such as newspaper notices and public hearings, as ineffective in reaching ordinary people (Maiyo &amp; Kinuthia, 2025).</w:t>
+        <w:t>County-level studies suggest it often does not. In Bungoma, participation improved governance and, through it, sustainable development (Hao et al., 2022). Kericho residents took part in budget meetings, public forums, record inspections and the election of project leaders, yet overall participation stayed low (Ngeno et al., 2023). Evidence from Laikipia and from a review of all 47 counties shows that the way a county communicates largely decides who turns up and who is left out (Wambugu et al., 2024; Wasike et al., 2024). At the national level, most Kenyans knew about the Finance Act, 2023, but very few took an active part in shaping it. Most of those surveyed felt that newspaper notices and public hearings did not reach ordinary people (Maiyo &amp; Kinuthia, 2025).</w:t>
       </w:r>
     </w:p>
     <w:p>
@@ -2711,7 +2711,7 @@
       </w:pPr>
       <w:r>
         <w:rPr/>
-        <w:t>Machakos County, which borders Nairobi to the east, provides a fitting setting in which to examine these issues. According to the 2019 census, the county had a population of 1,421,932 spread across urban centres such as Machakos Town and Athi River, fast-growing peri-urban areas along the Nairobi corridor, and largely rural, semi-arid zones such as Mwala, Masinga and Yatta (Kenya National Bureau of Statistics [KNBS], 2019). Since 2013 the county has used ward-level budget forums, sub-county development forums, sector working groups and public barazas to engage residents, and it has more recently added online and SMS feedback platforms. Its current development blueprint commits the county to participatory planning and delivery across health, water, agriculture and infrastructure (County Government of Machakos [CGM], 2023). Yet research in Matungulu Sub-County showed that, although participation in the planning of water projects had a significant effect on their outcomes, the level of participation remained low relative to what the law envisages (Mutua et al., 2024). This contrast between an elaborate participatory architecture and modest levels of meaningful involvement forms the background to the present study.</w:t>
+        <w:t>Machakos County, which borders Nairobi to the east, shows these tensions clearly. The 2019 census counted 1,421,932 residents (Kenya National Bureau of Statistics [KNBS], 2019). They live in busy towns such as Machakos and Athi River, in fast-growing settlements along the roads into Nairobi, and in dry farming areas such as Mwala, Masinga and Yatta where rainfall is unreliable. Since 2013 the county has held ward budget meetings, sub-county development forums, sector working groups and public barazas, and it has recently added online and SMS feedback platforms. Its current development plan commits it to participatory planning and delivery in health, water, agriculture and roads (County Government of Machakos [CGM], 2023). Even so, when Mutua et al. (2024) studied water projects in Matungulu, they found that participation during planning clearly shaped how the projects turned out, but that residents were involved far less than the law expects. That gap between a well-designed participation system and the limited involvement residents actually experience is the starting point for this study.</w:t>
       </w:r>
     </w:p>
     <w:p>
@@ -2720,7 +2720,7 @@
         <w:spacing w:lineRule="exact" w:line="360" w:before="240" w:after="120"/>
         <w:rPr/>
       </w:pPr>
-      <w:bookmarkStart w:id="11" w:name="__RefHeading___Toc1394_3754024237"/>
+      <w:bookmarkStart w:id="11" w:name="__RefHeading___Toc1394_1996925461"/>
       <w:bookmarkEnd w:id="11"/>
       <w:r>
         <w:rPr/>
@@ -2736,7 +2736,7 @@
       </w:pPr>
       <w:r>
         <w:rPr/>
-        <w:t>Ideally, public participation in a devolved system should ensure that county policies are shaped by the people they serve, carried out with their cooperation and monitored by them to completion. When this happens, projects are more likely to be finished on time, to meet their targets and to be protected by communities that regard them as their own (Loeffler &amp; Bovaird, 2021). The Constitution of Kenya (2010) and the County Governments Act (2012) were written with this ideal in mind, and the Kenya Policy on Public Participation further commits both levels of government to meaningful, rather than symbolic, engagement (Republic of Kenya, 2023).</w:t>
+        <w:t>Under devolution, public participation is supposed to do more than gather opinions. Residents should help shape county policies, support their delivery and keep watch until the work is done. Where this happens, projects are more likely to be finished on time, to meet their goals and to be cared for by communities who see them as their own (Loeffler &amp; Bovaird, 2021). This is the thinking behind the Constitution of Kenya (2010) and the County Governments Act (2012), and the Kenya Policy on Public Participation commits both levels of government to engagement that goes beyond a formality (Republic of Kenya, 2023).</w:t>
       </w:r>
     </w:p>
     <w:p>
@@ -2748,7 +2748,7 @@
       </w:pPr>
       <w:r>
         <w:rPr/>
-        <w:t>In practice, however, county policies in Kenya frequently fall short. Programmes are delayed, some facilities are completed but remain under-used, and residents often feel that forums are held to satisfy the law rather than to hear them (Maiyo &amp; Kinuthia, 2025; Ngeno et al., 2023). In Machakos County, the development plan commits the county to participatory delivery of its programmes (CGM, 2023), yet a study in Matungulu found participation in water projects to be well below the level required by law, with consequences for the performance of those projects (Mutua et al., 2024). If this situation persists, the county risks investing public funds in policies that do not reflect residents' priorities, that face local resistance or neglect, and that erode public trust in devolution itself.</w:t>
+        <w:t>The reality is less encouraging. County programmes are often delayed; some facilities are completed and then stand half-used; and many residents feel that forums are held to tick a legal box rather than to listen (Maiyo &amp; Kinuthia, 2025; Ngeno et al., 2023). Machakos County's development plan commits the county to participatory delivery of its programmes (CGM, 2023). Yet in Matungulu, residents were far less involved in water projects than the law requires, and the projects suffered as a result (Mutua et al., 2024). If this pattern continues, public money will keep going into projects that residents did not prioritise, do not protect and may even resist, and confidence in devolution will weaken.</w:t>
       </w:r>
     </w:p>
     <w:p>
@@ -2760,7 +2760,7 @@
       </w:pPr>
       <w:r>
         <w:rPr/>
-        <w:t>Although several studies have examined public participation in Kenya, most have concentrated on the planning and budgeting stages or on single sectors such as water, health facilities or construction (Katumo &amp; Odenyo, 2024; Malusha &amp; Njoroge, 2023; Mutua et al., 2024). Others have focused on the national legislative process rather than on county implementation (Maiyo &amp; Kinuthia, 2025), or on communication channels rather than on outcomes (Wambugu et al., 2024; Wasike et al., 2024). There is, as a result, little empirical evidence on how, and how far, public participation influences the implementation of policies across sectors in Machakos County. Without such evidence, neither the county government nor its residents can tell whether participatory structures are working as intended or simply fulfilling a legal formality. This study seeks to fill that gap by examining the influence of public participation on policy implementation in the Machakos County Government.</w:t>
+        <w:t>Kenyan research on participation has grown, but most of it looks at planning and budgeting or at a single sector such as water, health facilities or construction (Katumo &amp; Odenyo, 2024; Malusha &amp; Njoroge, 2023; Mutua et al., 2024). Some studies deal with national law-making rather than county delivery (Maiyo &amp; Kinuthia, 2025), and others measure how counties communicate without asking what difference participation makes to results (Wambugu et al., 2024; Wasike et al., 2024). As things stand, there is little evidence on how much public participation affects the implementation of policies across sectors in Machakos County. The county cannot tell whether its participation structures are working or merely meeting a legal requirement, and residents cannot tell either. This study sets out to provide that evidence.</w:t>
       </w:r>
     </w:p>
     <w:p>
@@ -2769,7 +2769,7 @@
         <w:spacing w:lineRule="exact" w:line="360" w:before="240" w:after="120"/>
         <w:rPr/>
       </w:pPr>
-      <w:bookmarkStart w:id="12" w:name="__RefHeading___Toc1396_3754024237"/>
+      <w:bookmarkStart w:id="12" w:name="__RefHeading___Toc1396_1996925461"/>
       <w:bookmarkEnd w:id="12"/>
       <w:r>
         <w:rPr/>
@@ -2785,7 +2785,7 @@
       </w:pPr>
       <w:r>
         <w:rPr/>
-        <w:t>The purpose of this study is to examine the influence of public participation on policy implementation in the Machakos County Government, Kenya, with a view to generating evidence that can strengthen participatory practice at the implementation stage of the county policy cycle.</w:t>
+        <w:t>The purpose of this study is to examine the influence of public participation on policy implementation in the Machakos County Government, Kenya, and to produce evidence the county can use to strengthen participation at the implementation stage.</w:t>
       </w:r>
     </w:p>
     <w:p>
@@ -2794,7 +2794,7 @@
         <w:spacing w:lineRule="exact" w:line="360" w:before="240" w:after="120"/>
         <w:rPr/>
       </w:pPr>
-      <w:bookmarkStart w:id="13" w:name="__RefHeading___Toc1398_3754024237"/>
+      <w:bookmarkStart w:id="13" w:name="__RefHeading___Toc1398_1996925461"/>
       <w:bookmarkEnd w:id="13"/>
       <w:r>
         <w:rPr/>
@@ -2807,7 +2807,7 @@
         <w:spacing w:lineRule="exact" w:line="360" w:before="160" w:after="100"/>
         <w:rPr/>
       </w:pPr>
-      <w:bookmarkStart w:id="14" w:name="__RefHeading___Toc1400_3754024237"/>
+      <w:bookmarkStart w:id="14" w:name="__RefHeading___Toc1400_1996925461"/>
       <w:bookmarkEnd w:id="14"/>
       <w:r>
         <w:rPr/>
@@ -2832,7 +2832,7 @@
         <w:spacing w:lineRule="exact" w:line="360" w:before="160" w:after="100"/>
         <w:rPr/>
       </w:pPr>
-      <w:bookmarkStart w:id="15" w:name="__RefHeading___Toc1402_3754024237"/>
+      <w:bookmarkStart w:id="15" w:name="__RefHeading___Toc1402_1996925461"/>
       <w:bookmarkEnd w:id="15"/>
       <w:r>
         <w:rPr/>
@@ -2929,7 +2929,7 @@
         <w:spacing w:lineRule="exact" w:line="360" w:before="240" w:after="120"/>
         <w:rPr/>
       </w:pPr>
-      <w:bookmarkStart w:id="16" w:name="__RefHeading___Toc1404_3754024237"/>
+      <w:bookmarkStart w:id="16" w:name="__RefHeading___Toc1404_1996925461"/>
       <w:bookmarkEnd w:id="16"/>
       <w:r>
         <w:rPr/>
@@ -3026,7 +3026,7 @@
         <w:spacing w:lineRule="exact" w:line="360" w:before="240" w:after="120"/>
         <w:rPr/>
       </w:pPr>
-      <w:bookmarkStart w:id="17" w:name="__RefHeading___Toc1406_3754024237"/>
+      <w:bookmarkStart w:id="17" w:name="__RefHeading___Toc1406_1996925461"/>
       <w:bookmarkEnd w:id="17"/>
       <w:r>
         <w:rPr/>
@@ -3042,7 +3042,7 @@
       </w:pPr>
       <w:r>
         <w:rPr/>
-        <w:t>In line with the fourth objective, the study will test the following null hypothesis at the 0.05 level of significance:</w:t>
+        <w:t>The fourth objective will be addressed by testing the following null hypothesis at the 0.05 level of significance:</w:t>
       </w:r>
     </w:p>
     <w:p>
@@ -3071,7 +3071,7 @@
         <w:spacing w:lineRule="exact" w:line="360" w:before="240" w:after="120"/>
         <w:rPr/>
       </w:pPr>
-      <w:bookmarkStart w:id="18" w:name="__RefHeading___Toc1408_3754024237"/>
+      <w:bookmarkStart w:id="18" w:name="__RefHeading___Toc1408_1996925461"/>
       <w:bookmarkEnd w:id="18"/>
       <w:r>
         <w:rPr/>
@@ -3087,7 +3087,7 @@
       </w:pPr>
       <w:r>
         <w:rPr/>
-        <w:t>The study is justified on three grounds. First, the Kenya Policy on Public Participation and the Public Participation Bill, 2025 signal a national effort to standardise participation (Republic of Kenya, 2023, 2025). Evidence from a county that has operated participatory structures for over a decade can inform how those standards are applied at the implementation stage. Second, Machakos County allocates a large share of its development budget to health, water, agriculture and roads (CGM, 2023), sectors in which community cooperation is essential for projects to succeed. Understanding how participation affects delivery in these sectors has direct value for public spending. Third, the study responds to calls in the literature to move beyond counting forums and toward understanding whether participation actually changes what government does (Jäntti et al., 2023; Kurkela et al., 2024).</w:t>
+        <w:t>The timing of this study is apt. With the Kenya Policy on Public Participation in place and the Public Participation Bill, 2025 before Parliament, the country is working out what good participation should look like (Republic of Kenya, 2023, 2025). A county that has run participatory structures for more than ten years has a good deal to teach that process, especially about the implementation stage, which national guidelines say relatively little about. The study also matters for public spending. Machakos directs much of its development budget to health, water, agriculture and roads (CGM, 2023), and in these sectors projects rarely succeed without local cooperation. Finally, scholars have urged researchers to stop counting meetings and start asking whether participation changes what governments actually do (Jäntti et al., 2023; Kurkela et al., 2024). This study takes up that call.</w:t>
       </w:r>
     </w:p>
     <w:p>
@@ -3096,7 +3096,7 @@
         <w:spacing w:lineRule="exact" w:line="360" w:before="240" w:after="120"/>
         <w:rPr/>
       </w:pPr>
-      <w:bookmarkStart w:id="19" w:name="__RefHeading___Toc1410_3754024237"/>
+      <w:bookmarkStart w:id="19" w:name="__RefHeading___Toc1410_1996925461"/>
       <w:bookmarkEnd w:id="19"/>
       <w:r>
         <w:rPr/>
@@ -3112,7 +3112,7 @@
       </w:pPr>
       <w:r>
         <w:rPr/>
-        <w:t>The findings of this study are expected to benefit several groups. The Machakos County Government, particularly the departments responsible for public participation, finance and economic planning, will obtain evidence on which participation mechanisms residents find useful and which they regard as symbolic. This can guide the redesign of forums, feedback systems and project management committees.</w:t>
+        <w:t>The Machakos County Government stands to gain most directly. The departments that handle public participation, finance and economic planning will learn which channels residents value and which they see as window dressing, and can use this to rethink how forums, feedback and project committees are run.</w:t>
       </w:r>
     </w:p>
     <w:p>
@@ -3124,7 +3124,7 @@
       </w:pPr>
       <w:r>
         <w:rPr/>
-        <w:t>The Council of Governors and other county governments operate under the same constitutional framework and face similar pressures. They may draw lessons from the study on how to connect citizen input with the delivery of programmes. National policy makers, including the drafters of public participation legislation, may use the findings to set standards that go beyond holding hearings and address feedback and follow-up.</w:t>
+        <w:t>Other counties work under the same Constitution and face similar pressures, so the Council of Governors and individual county governments may find useful lessons here on linking citizen input to delivery. Those drafting national participation laws may also use the findings to set standards that cover feedback and follow-up, and not only the holding of hearings.</w:t>
       </w:r>
     </w:p>
     <w:p>
@@ -3136,7 +3136,7 @@
       </w:pPr>
       <w:r>
         <w:rPr/>
-        <w:t>Residents and civil society organisations in Machakos County will gain a clearer picture of how their involvement, or lack of it, shapes the services they receive, which may encourage more informed and sustained engagement. Finally, scholars of public administration and devolution will benefit from empirical evidence on participation at the implementation stage, an area that has received less attention than planning and budgeting in Kenyan research.</w:t>
+        <w:t>For residents and civil society groups in Machakos, the study offers a clearer view of how their involvement, or their absence, affects the services they receive. This may encourage them to stay engaged. For researchers in public administration and devolution, it adds evidence on the implementation stage, which Kenyan studies have so far touched on only lightly.</w:t>
       </w:r>
     </w:p>
     <w:p>
@@ -3145,7 +3145,7 @@
         <w:spacing w:lineRule="exact" w:line="360" w:before="240" w:after="120"/>
         <w:rPr/>
       </w:pPr>
-      <w:bookmarkStart w:id="20" w:name="__RefHeading___Toc1412_3754024237"/>
+      <w:bookmarkStart w:id="20" w:name="__RefHeading___Toc1412_1996925461"/>
       <w:bookmarkEnd w:id="20"/>
       <w:r>
         <w:rPr/>
@@ -3161,7 +3161,7 @@
       </w:pPr>
       <w:r>
         <w:rPr/>
-        <w:t>Some residents may be reluctant to share honest opinions about county officials or programmes for fear of victimisation. To reduce this risk, the researcher will guarantee anonymity, avoid collecting names on questionnaires, and explain the academic purpose of the study before data collection. The study will also rely partly on self-reported perceptions of implementation effectiveness, which may not match official performance records. Where possible, the researcher will compare responses with county progress and budget implementation reports. In addition, the semi-arid and dispersed nature of rural wards such as those in Mwala may make it costly to reach respondents. This will be addressed by engaging trained research assistants who are familiar with the area and by scheduling visits around market days and local meetings.</w:t>
+        <w:t>Some residents may hesitate to criticise county officials or programmes openly, fearing that it could count against them. The researcher will guard against this by keeping questionnaires anonymous and explaining clearly that the study is purely academic. A second limitation is that residents' views of how well policies were implemented are perceptions and may not match official records. Where possible, their responses will be checked against county progress and budget implementation reports. Reaching respondents in the dry, scattered villages of Mwala may also be slow and costly. Research assistants who know the area will be engaged, and visits will be timed around market days and local meetings, when people are easier to find.</w:t>
       </w:r>
     </w:p>
     <w:p>
@@ -3170,7 +3170,7 @@
         <w:spacing w:lineRule="exact" w:line="360" w:before="240" w:after="120"/>
         <w:rPr/>
       </w:pPr>
-      <w:bookmarkStart w:id="21" w:name="__RefHeading___Toc1414_3754024237"/>
+      <w:bookmarkStart w:id="21" w:name="__RefHeading___Toc1414_1996925461"/>
       <w:bookmarkEnd w:id="21"/>
       <w:r>
         <w:rPr/>
@@ -3186,7 +3186,7 @@
       </w:pPr>
       <w:r>
         <w:rPr/>
-        <w:t>The study will be confined to the Machakos County Government and will focus on public participation in the implementation, rather than the formulation, of county policies. Geographically, it will cover three of the county's sub-counties, namely Machakos Town, Matungulu and Mwala, which represent urban, peri-urban and rural settings respectively. The respondents will be adult residents aged 18 years and above together with selected county officials. The study will consider policies, programmes and projects implemented within the five years preceding data collection, a period that falls under the current development plan (CGM, 2023).</w:t>
+        <w:t>The study is limited to the Machakos County Government and looks at participation in the implementation of county policies, not in their formulation. It covers three sub-counties: Machakos Town (urban), Matungulu (peri-urban) and Mwala (rural). Respondents will be residents aged 18 years and above, together with selected county officials. Only policies, programmes and projects implemented in the five years before data collection will be considered, which places them within the period of the current development plan (CGM, 2023).</w:t>
       </w:r>
     </w:p>
     <w:p>
@@ -3195,7 +3195,7 @@
         <w:spacing w:lineRule="exact" w:line="360" w:before="240" w:after="120"/>
         <w:rPr/>
       </w:pPr>
-      <w:bookmarkStart w:id="22" w:name="__RefHeading___Toc1416_3754024237"/>
+      <w:bookmarkStart w:id="22" w:name="__RefHeading___Toc1416_1996925461"/>
       <w:bookmarkEnd w:id="22"/>
       <w:r>
         <w:rPr/>
@@ -3211,7 +3211,7 @@
       </w:pPr>
       <w:r>
         <w:rPr/>
-        <w:t>The study assumes that respondents will provide honest and accurate answers; that residents in the selected sub-counties have had some exposure to county policy implementation activities within the reference period; that county officials will grant access to relevant documents and be available for interviews; and that the three sampled sub-counties reasonably reflect the diversity of participation experiences within Machakos County.</w:t>
+        <w:t>The study assumes that respondents will answer honestly and accurately, and that residents of the selected sub-counties have had some contact with county implementation activities during the reference period. It further assumes that county officials will make time for interviews and allow access to relevant documents, and that the three sampled sub-counties broadly reflect the range of participation experiences across the county.</w:t>
       </w:r>
       <w:r>
         <w:br w:type="page"/>
@@ -3224,7 +3224,7 @@
         <w:jc w:val="center"/>
         <w:rPr/>
       </w:pPr>
-      <w:bookmarkStart w:id="23" w:name="__RefHeading___Toc1418_3754024237"/>
+      <w:bookmarkStart w:id="23" w:name="__RefHeading___Toc1418_1996925461"/>
       <w:bookmarkEnd w:id="23"/>
       <w:r>
         <w:rPr/>
@@ -3239,7 +3239,7 @@
         <w:spacing w:lineRule="exact" w:line="360" w:before="240" w:after="120"/>
         <w:rPr/>
       </w:pPr>
-      <w:bookmarkStart w:id="24" w:name="__RefHeading___Toc1420_3754024237"/>
+      <w:bookmarkStart w:id="24" w:name="__RefHeading___Toc1420_1996925461"/>
       <w:bookmarkEnd w:id="24"/>
       <w:r>
         <w:rPr/>
@@ -3255,7 +3255,7 @@
       </w:pPr>
       <w:r>
         <w:rPr/>
-        <w:t>This chapter reviews literature related to public participation and policy implementation. It begins with the theories that anchor the study, followed by an empirical review organised around the four specific objectives. It then presents the conceptual framework, a critique of the reviewed literature, and a summary of the research gaps the study intends to fill.</w:t>
+        <w:t>This chapter reviews the literature on public participation and policy implementation. It opens with the two theories on which the study rests and then reviews empirical studies under each of the four specific objectives. The conceptual framework follows, together with a critique of the literature and a summary of the gaps this study aims to fill.</w:t>
       </w:r>
     </w:p>
     <w:p>
@@ -3264,7 +3264,7 @@
         <w:spacing w:lineRule="exact" w:line="360" w:before="240" w:after="120"/>
         <w:rPr/>
       </w:pPr>
-      <w:bookmarkStart w:id="25" w:name="__RefHeading___Toc1422_3754024237"/>
+      <w:bookmarkStart w:id="25" w:name="__RefHeading___Toc1422_1996925461"/>
       <w:bookmarkEnd w:id="25"/>
       <w:r>
         <w:rPr/>
@@ -3280,7 +3280,7 @@
       </w:pPr>
       <w:r>
         <w:rPr/>
-        <w:t>The study is guided by two complementary theories. Arnstein's Ladder of Citizen Participation explains the depth of citizen influence, while the Theory of Co-production explains why citizen involvement matters for the delivery of public services and policies.</w:t>
+        <w:t>Two theories guide the study. Arnstein's Ladder of Citizen Participation helps to judge how much real influence citizens have, while the Theory of Co-production explains why their involvement matters for delivering public services and policies.</w:t>
       </w:r>
     </w:p>
     <w:p>
@@ -3289,7 +3289,7 @@
         <w:spacing w:lineRule="exact" w:line="360" w:before="160" w:after="100"/>
         <w:rPr/>
       </w:pPr>
-      <w:bookmarkStart w:id="26" w:name="__RefHeading___Toc1424_3754024237"/>
+      <w:bookmarkStart w:id="26" w:name="__RefHeading___Toc1424_1996925461"/>
       <w:bookmarkEnd w:id="26"/>
       <w:r>
         <w:rPr/>
@@ -3305,7 +3305,7 @@
       </w:pPr>
       <w:r>
         <w:rPr/>
-        <w:t>The Ladder of Citizen Participation was advanced by Arnstein (1969), who argued that participation is fundamentally about the redistribution of power. She arranged forms of participation along eight rungs grouped into three levels. The lowest level, comprising manipulation and therapy, represents non-participation. The middle level, made up of informing, consultation and placation, represents degrees of tokenism in which citizens may be heard but lack the power to ensure their views are acted upon. The upper level, covering partnership, delegated power and citizen control, represents genuine citizen power. The central argument of the theory is that participation without a transfer of influence is an empty ritual that allows authorities to claim that everyone was consulted while only some benefit.</w:t>
+        <w:t>Arnstein (1969) argued that citizen participation is, at heart, a question of who holds power. She described eight rungs arranged in three bands. At the bottom, manipulation and therapy amount to non-participation. The middle band, made up of informing, consultation and placation, is what she called tokenism: citizens are allowed to speak, but they cannot make sure anyone acts on what they say. Only at the top, through partnership, delegated power and citizen control, do citizens hold real power. Arnstein's main point was that participation without any shift in power is an empty ritual. It lets those in authority claim that everyone was consulted while decisions continue to favour a few.</w:t>
       </w:r>
     </w:p>
     <w:p>
@@ -3317,7 +3317,7 @@
       </w:pPr>
       <w:r>
         <w:rPr/>
-        <w:t>The ladder remains widely used because it offers a clear way of judging not only whether participation occurred but how deep it went (Abas et al., 2023). It has, however, been criticised for treating participation as a single hierarchy in which more control is always better, and for overlooking the fact that citizens may prefer different forms of involvement for different issues (De Weger et al., 2022). It also says little about the institutional arrangements needed to move up the ladder. Despite these limitations, the theory is relevant to this study because Kenya's legal framework is written in the language of the upper rungs, while empirical studies suggest that practice often settles on the middle rungs of informing and consultation (Maiyo &amp; Kinuthia, 2025; Ngeno et al., 2023). The theory therefore informs the first and second objectives, by providing a yardstick for gauging the extent and depth of participation and for classifying the mechanisms the county uses.</w:t>
+        <w:t>The ladder is still widely used because it gives a simple way to judge how deep participation goes, beyond whether it happened at all (Abas et al., 2023). Critics say it treats participation as a single climb in which more control is always better, when in fact citizens may want different kinds of involvement for different issues (De Weger et al., 2022). It also has little to say about the institutions needed to move up the rungs. Even with these weaknesses, the ladder suits this study well. Kenyan law uses the language of the upper rungs, while research keeps finding that practice stops somewhere around informing and consultation (Maiyo &amp; Kinuthia, 2025; Ngeno et al., 2023). The theory therefore informs the first and second objectives, giving the study a yardstick for how deeply residents take part and a way of classifying the channels the county uses.</w:t>
       </w:r>
     </w:p>
     <w:p>
@@ -3326,7 +3326,7 @@
         <w:spacing w:lineRule="exact" w:line="360" w:before="160" w:after="100"/>
         <w:rPr/>
       </w:pPr>
-      <w:bookmarkStart w:id="27" w:name="__RefHeading___Toc1426_3754024237"/>
+      <w:bookmarkStart w:id="27" w:name="__RefHeading___Toc1426_1996925461"/>
       <w:bookmarkEnd w:id="27"/>
       <w:r>
         <w:rPr/>
@@ -3342,7 +3342,7 @@
       </w:pPr>
       <w:r>
         <w:rPr/>
-        <w:t>The Theory of Co-production is associated with Ostrom (1996), who observed that the quality of many public services depends on the contributions of both public officials and the citizens who use them. In her view, citizens are not simply consumers of services but active producers whose knowledge, effort and cooperation are needed for services to work. Co-production is most likely to succeed when the inputs of government and citizens complement each other, and when legal and institutional arrangements make such collaboration possible. Later scholarship has extended the idea to four related activities: co-commissioning, co-design, co-delivery and co-assessment of public services (Loeffler &amp; Bovaird, 2021).</w:t>
+        <w:t>The idea of co-production is closely linked to Ostrom (1996). She observed that many public services depend on effort from both officials and the citizens who use them. A school needs pupils and parents as much as teachers, and a water scheme needs users who pay, report leaks and protect the pipes. Co-production works best when what government and citizens bring to a service complement each other, and when rules and institutions make that cooperation possible. Later writers have broken co-production into four activities: co-commissioning, co-design, co-delivery and co-assessment of services (Loeffler &amp; Bovaird, 2021).</w:t>
       </w:r>
     </w:p>
     <w:p>
@@ -3354,7 +3354,7 @@
       </w:pPr>
       <w:r>
         <w:rPr/>
-        <w:t>The theory has been criticised for placing extra burdens on citizens, especially the poor, who may lack the time and resources to contribute, and for blurring lines of accountability when outcomes are shared (Loeffler &amp; Bovaird, 2021). Nonetheless, it is relevant to this study because it moves the discussion beyond decision-making into the delivery of policies. It suggests that policies are more likely to be implemented effectively when residents take part in monitoring projects, contributing local knowledge and protecting completed facilities. The theory therefore underpins the third and fourth objectives, by explaining why barriers to participation weaken implementation and why higher levels of participation should be associated with better implementation outcomes.</w:t>
+        <w:t>The theory has its critics. It can shift extra work onto citizens, especially poorer ones who have little spare time or money, and it can blur who is accountable when things go wrong (Loeffler &amp; Bovaird, 2021). Its value for this study is that it carries the discussion past decision-making and into delivery. It implies that county policies will be better implemented when residents help monitor projects, share local knowledge and protect finished facilities. The theory therefore underpins the third and fourth objectives. It explains why obstacles to participation should weaken implementation, and why more participation should go with better results.</w:t>
       </w:r>
     </w:p>
     <w:p>
@@ -3363,7 +3363,7 @@
         <w:spacing w:lineRule="exact" w:line="360" w:before="240" w:after="120"/>
         <w:rPr/>
       </w:pPr>
-      <w:bookmarkStart w:id="28" w:name="__RefHeading___Toc1428_3754024237"/>
+      <w:bookmarkStart w:id="28" w:name="__RefHeading___Toc1428_1996925461"/>
       <w:bookmarkEnd w:id="28"/>
       <w:r>
         <w:rPr/>
@@ -3379,7 +3379,7 @@
       </w:pPr>
       <w:r>
         <w:rPr/>
-        <w:t>This section reviews studies related to each of the four specific objectives.</w:t>
+        <w:t>The empirical studies are reviewed below under each of the four specific objectives.</w:t>
       </w:r>
     </w:p>
     <w:p>
@@ -3388,7 +3388,7 @@
         <w:spacing w:lineRule="exact" w:line="360" w:before="160" w:after="100"/>
         <w:rPr/>
       </w:pPr>
-      <w:bookmarkStart w:id="29" w:name="__RefHeading___Toc1430_3754024237"/>
+      <w:bookmarkStart w:id="29" w:name="__RefHeading___Toc1430_1996925461"/>
       <w:bookmarkEnd w:id="29"/>
       <w:r>
         <w:rPr/>
@@ -3404,7 +3404,7 @@
       </w:pPr>
       <w:r>
         <w:rPr/>
-        <w:t>Several studies indicate that citizen participation in county affairs in Kenya is broad in form but shallow in substance. Ngeno et al. (2023) used a concurrent mixed-methods design in Kericho County and found that residents took part in budget preparation, attended public forums, scrutinised records, elected project leaders and attended seminars, yet participation across all of these modes was low. The study was limited to development projects and did not link participation to implementation outcomes, which the present study will do.</w:t>
+        <w:t>Kenyan studies suggest that participation in county affairs takes many forms but seldom goes very deep. Using a concurrent mixed-methods design in Kericho County, Ngeno et al. (2023) found residents involved in budget preparation, public forums, scrutiny of records, the election of project leaders and seminars. Across all of these, however, participation was low. Their study was confined to development projects and did not ask how participation affected outcomes, which is one of the questions the present study will take up.</w:t>
       </w:r>
     </w:p>
     <w:p>
@@ -3416,7 +3416,7 @@
       </w:pPr>
       <w:r>
         <w:rPr/>
-        <w:t>In Machakos County, Mutua et al. (2024) collected data from 220 household heads, a water project manager and eight water user committee representatives in Matungulu Sub-County. They found that participation in the planning phase had a significant influence on the outcomes of water projects, but that actual levels of involvement were low compared with what the legal framework envisages. Because their study focused on the planning phase of water projects, it leaves open the question of how residents participate once policies across different sectors are being implemented.</w:t>
+        <w:t>Closer to home, Mutua et al. (2024) surveyed 220 household heads in Matungulu Sub-County and also spoke to a water project manager and eight members of water user committees. Participation during planning had a significant effect on how the water projects turned out, but actual involvement fell well short of what the law envisages. Because the study dealt only with the planning of water projects, it does not show how residents take part once policies in other sectors are being carried out.</w:t>
       </w:r>
     </w:p>
     <w:p>
@@ -3428,7 +3428,7 @@
       </w:pPr>
       <w:r>
         <w:rPr/>
-        <w:t>A similar pattern emerges at the national level. Maiyo and Kinuthia (2025), studying 86 respondents drawn from citizens, civil society and policy makers, reported that although many people were aware of the Finance Act, 2023, only a small proportion took part actively in its consideration. Abas et al. (2023), in a systematic review of a decade of research on participation in local authority planning, similarly concluded that participation is often limited to the early stages of decision-making and seldom extends into delivery. These studies collectively suggest that the extent of participation in implementation is likely to be modest, a proposition this study will test in Machakos County.</w:t>
+        <w:t>The national picture is similar. Maiyo and Kinuthia (2025) collected views from 86 citizens, civil society members and policy makers and found that, although many people knew about the Finance Act, 2023, few took an active part in it. Reviewing ten years of research on participation in local planning, Abas et al. (2023) concluded that participation tends to be concentrated in the early stages of decision-making and rarely carries through to delivery. These findings lead the researcher to expect modest levels of participation in implementation in Machakos, an expectation the study will test.</w:t>
       </w:r>
     </w:p>
     <w:p>
@@ -3437,7 +3437,7 @@
         <w:spacing w:lineRule="exact" w:line="360" w:before="160" w:after="100"/>
         <w:rPr/>
       </w:pPr>
-      <w:bookmarkStart w:id="30" w:name="__RefHeading___Toc1432_3754024237"/>
+      <w:bookmarkStart w:id="30" w:name="__RefHeading___Toc1432_1996925461"/>
       <w:bookmarkEnd w:id="30"/>
       <w:r>
         <w:rPr/>
@@ -3453,7 +3453,7 @@
       </w:pPr>
       <w:r>
         <w:rPr/>
-        <w:t>The channels through which counties invite citizen input strongly influence who participates. In Laikipia County, Wambugu et al. (2024) found that the mode of communication significantly affected the level of participation, with face-to-face contact and SMS messages being the most effective in mobilising residents to attend public participation meetings. Wasike et al. (2024), in a qualitative assessment of communication frameworks across Kenya's 47 counties, observed that the approaches used to publicise participation opportunities varied widely in their reach and effectiveness. Maiyo and Kinuthia (2025) reported that newspaper adverts, written memoranda and public hearings dominated participation in the Finance Act, 2023, yet the overwhelming majority of respondents considered them ineffective in reaching a broad section of the population.</w:t>
+        <w:t>How a county invites people to take part has a lot to do with who shows up. In Laikipia County, Wambugu et al. (2024) found that the way information was communicated made a significant difference to participation, and that face-to-face contact and SMS messages were the most effective ways of getting people to meetings. Looking across all 47 counties, Wasike et al. (2024) found that the reach and success of county communication approaches varied a great deal. In the case of the Finance Act, 2023, newspaper adverts, written memoranda and public hearings were the main channels used, yet almost all respondents felt they did not reach most of the population (Maiyo &amp; Kinuthia, 2025).</w:t>
       </w:r>
     </w:p>
     <w:p>
@@ -3465,7 +3465,7 @@
       </w:pPr>
       <w:r>
         <w:rPr/>
-        <w:t>Digital channels have been proposed as a way of widening access. A systematic review of e-participation by Benlahcene et al. (2024) found that online platforms can make participation more convenient, but that citizens face obstacles such as limited digital skills, poor connectivity and low trust in how their contributions are handled. Internationally, De Weger et al. (2022) showed that citizens were more willing to engage when municipalities used accessible language and explained how their input would be used, while Linstad et al. (2024) demonstrated how a formal stakeholder board could serve as a standing mechanism for aligning interests during implementation. These studies focus mainly on the design and reach of mechanisms; few examine whether particular mechanisms are associated with better implementation outcomes at the county level, which is an aim of this study.</w:t>
+        <w:t>Online channels are often put forward as a way to widen access. In their review of e-participation research, Benlahcene et al. (2024) found that digital platforms make taking part more convenient, but citizens face hurdles such as weak digital skills, poor connectivity and doubts about what happens to their contributions. De Weger et al. (2022) noted that Dutch residents engaged more readily when municipalities used plain language and explained how input would be used. In Norway, a formal stakeholder board served as a standing channel for aligning interests throughout implementation (Linstad et al., 2024). Most of these studies look at how mechanisms are designed and how far they reach. Very few ask whether a particular mechanism leads to better implementation at county level, and this study intends to do so.</w:t>
       </w:r>
     </w:p>
     <w:p>
@@ -3474,7 +3474,7 @@
         <w:spacing w:lineRule="exact" w:line="360" w:before="160" w:after="100"/>
         <w:rPr/>
       </w:pPr>
-      <w:bookmarkStart w:id="31" w:name="__RefHeading___Toc1434_3754024237"/>
+      <w:bookmarkStart w:id="31" w:name="__RefHeading___Toc1434_1996925461"/>
       <w:bookmarkEnd w:id="31"/>
       <w:r>
         <w:rPr/>
@@ -3490,7 +3490,7 @@
       </w:pPr>
       <w:r>
         <w:rPr/>
-        <w:t>The literature identifies a range of barriers. Hao et al. (2022), using structural equation modelling on data from Bungoma County, found that the integration of participation into governance faced several challenges that weakened its contribution to sustainable development. Kurkela et al. (2024), drawing on interviews with 14 key actors in the city of Helsinki, identified organisational structures, organisational culture and adequate resources as the three pillars of influential participation, implying that weaknesses in any of these become barriers. Jäntti et al. (2023) added that participation falters when citizen input is collected at one level of the organisation but not carried through to the units responsible for execution.</w:t>
+        <w:t>Researchers have identified many obstacles to effective participation. In Bungoma County, Hao et al. (2022) used structural equation modelling and found that several challenges limited how far participation was integrated into governance and, with it, how much it contributed to sustainable development. Interviews with 14 key actors in Helsinki led Kurkela et al. (2024) to conclude that structures, culture and resources determine whether participation has influence, so a shortfall in any one of them becomes a barrier. Jäntti et al. (2023) added that participation falters when citizens' views are gathered in one part of an organisation and never reach the units that carry out the work.</w:t>
       </w:r>
     </w:p>
     <w:p>
@@ -3502,7 +3502,7 @@
       </w:pPr>
       <w:r>
         <w:rPr/>
-        <w:t>In Uganda, Mukiga et al. (2024) interviewed 66 participants, including health workers, residents, local councillors and administrators, and found that the lack of a formalised citizen participation structure, specifically the absence of an active health committee, prevented residents from influencing how local health services were delivered. Benlahcene et al. (2024) pointed to digital divides as a further barrier, while Maiyo and Kinuthia (2025) highlighted short notice periods and inaccessible venues. Although these studies are informative, they were conducted in different settings and sectors. The specific combination of barriers facing residents of Machakos County, where urban, peri-urban and rural conditions coexist, has not been systematically documented.</w:t>
+        <w:t>In Uganda, Mukiga et al. (2024) interviewed 66 people, among them health workers, residents, local councillors and administrators. With no active health committee in place, residents had no formal way to influence how local health services were run. Other studies point to the digital divide (Benlahcene et al., 2024) and to short notice and hard-to-reach venues (Maiyo &amp; Kinuthia, 2025). These studies are useful, but they come from different places and sectors. Nobody has yet mapped the particular mix of barriers faced by Machakos residents, who live in urban, peri-urban and rural settings within one county.</w:t>
       </w:r>
     </w:p>
     <w:p>
@@ -3511,7 +3511,7 @@
         <w:spacing w:lineRule="exact" w:line="360" w:before="160" w:after="100"/>
         <w:rPr/>
       </w:pPr>
-      <w:bookmarkStart w:id="32" w:name="__RefHeading___Toc1436_3754024237"/>
+      <w:bookmarkStart w:id="32" w:name="__RefHeading___Toc1436_1996925461"/>
       <w:bookmarkEnd w:id="32"/>
       <w:r>
         <w:rPr/>
@@ -3527,7 +3527,7 @@
       </w:pPr>
       <w:r>
         <w:rPr/>
-        <w:t>A growing body of evidence links participation to implementation outcomes. Katumo and Odenyo (2024) examined public participation in the implementation of county government projects in Makueni County, a neighbouring county widely cited for its participatory budgeting model, and reported that citizen involvement was associated with the implementation of county projects. Malusha and Njoroge (2023) studied the effects of informing, consultation, collaboration and empowerment on the implementation of the County Integrated Development Plan in Voi Sub-County, Taita Taveta, drawing on participatory democracy theory. Mutua et al. (2024) likewise showed that participation in the planning of water projects in Matungulu significantly influenced their outcomes.</w:t>
+        <w:t>A number of studies have linked participation to implementation. In neighbouring Makueni County, well known for its participatory budgeting, Katumo and Odenyo (2024) found that citizen involvement was associated with the implementation of county projects. Malusha and Njoroge (2023), working from participatory democracy theory, examined how informing, consultation, collaboration and empowerment affected the implementation of the County Integrated Development Plan in Voi Sub-County, Taita Taveta. In Matungulu, participation in planning water projects significantly influenced how well those projects performed (Mutua et al., 2024).</w:t>
       </w:r>
     </w:p>
     <w:p>
@@ -3539,7 +3539,7 @@
       </w:pPr>
       <w:r>
         <w:rPr/>
-        <w:t>The international evidence adds an important qualification. Abdi et al. (2025), surveying 446 residents of Mogadishu, found that participation increased trust in local government partly because it made the administration appear more responsive. On the other hand, Holum (2023) found that government efforts to widen participation in Norwegian municipalities had very limited effect on trust, and Ardanaz et al. (2023) and Campbell (2023) reported only marginal gains in trust from information about, or experience of, participatory processes. Taken together, these studies suggest that participation is most likely to improve implementation when citizens can see that their input led to change. Most of the Kenyan studies, however, have focused on single sectors or on the planning stage. This study will examine the relationship across sectors and at the implementation stage in Machakos County.</w:t>
+        <w:t>Studies from other countries add a note of caution. In Mogadishu, Abdi et al. (2025) surveyed 446 residents and found that participation raised trust in local government, partly because it made the administration appear more responsive. Yet in Norway, government efforts to widen participation barely affected trust (Holum, 2023), and studies in Argentina and South Korea found only small gains in trust from learning about or experiencing participatory processes (Ardanaz et al., 2023; Campbell, 2023). What emerges is that participation improves results mainly when citizens can see their input making a difference. Most Kenyan studies have looked at one sector or at the planning stage. This study will examine the relationship across sectors and at the implementation stage in Machakos County.</w:t>
       </w:r>
     </w:p>
     <w:p>
@@ -3548,7 +3548,7 @@
         <w:spacing w:lineRule="exact" w:line="360" w:before="240" w:after="120"/>
         <w:rPr/>
       </w:pPr>
-      <w:bookmarkStart w:id="33" w:name="__RefHeading___Toc1438_3754024237"/>
+      <w:bookmarkStart w:id="33" w:name="__RefHeading___Toc1438_1996925461"/>
       <w:bookmarkEnd w:id="33"/>
       <w:r>
         <w:rPr/>
@@ -3564,7 +3564,7 @@
       </w:pPr>
       <w:r>
         <w:rPr/>
-        <w:t>The conceptual framework in Figure 2.1 shows the hypothesised relationship between public participation, the independent variable, and the effectiveness of policy implementation, the dependent variable. Public participation is operationalised through three dimensions drawn from the specific objectives: the level of participation, the mechanisms used to facilitate it, and the barriers that constrain it. The effectiveness of policy implementation is measured by timely delivery, attainment of targets, beneficiary satisfaction and community ownership. Institutional capacity, political goodwill and availability of budgetary resources are treated as intervening variables that may affect the strength of the relationship.</w:t>
+        <w:t>Figure 2.1 sets out the expected relationship between public participation, the independent variable, and the effectiveness of policy implementation, the dependent variable. Drawing on the specific objectives, participation is measured along three dimensions: how much residents take part, the mechanisms through which they do so and the barriers they encounter. Implementation effectiveness is judged by whether programmes are delivered on time, whether they meet their targets, whether beneficiaries are satisfied and whether communities take ownership of what is delivered. The county's institutional capacity, political goodwill and available budget are treated as intervening variables that may strengthen or weaken the relationship.</w:t>
       </w:r>
     </w:p>
     <w:p>
@@ -3654,7 +3654,7 @@
         <w:spacing w:lineRule="exact" w:line="360" w:before="240" w:after="120"/>
         <w:rPr/>
       </w:pPr>
-      <w:bookmarkStart w:id="34" w:name="__RefHeading___Toc1440_3754024237"/>
+      <w:bookmarkStart w:id="34" w:name="__RefHeading___Toc1440_1996925461"/>
       <w:bookmarkEnd w:id="34"/>
       <w:r>
         <w:rPr/>
@@ -3670,7 +3670,7 @@
       </w:pPr>
       <w:r>
         <w:rPr/>
-        <w:t>The reviewed literature has three notable weaknesses. First, many Kenyan studies examine participation at the planning or budgeting stage and assume that its benefits carry over into implementation (Malusha &amp; Njoroge, 2023; Mutua et al., 2024). This assumption is seldom tested. Second, a number of studies rely on small samples or single-sector cases, such as water projects or health facilities, which limits the extent to which their findings apply across a county's policy portfolio (Katumo &amp; Odenyo, 2024; Maiyo &amp; Kinuthia, 2025). Third, studies on mechanisms tend to measure reach and attendance rather than influence, so they reveal who came to a forum but not whether the forum changed anything (Wambugu et al., 2024; Wasike et al., 2024). The international literature is richer on organisational and trust-related questions (Holum, 2023; Kurkela et al., 2024), but it comes from contexts with stronger institutions and higher resource levels than Kenyan counties. This study addresses these weaknesses by combining a cross-sectoral survey with key informant interviews, and by focusing explicitly on the implementation stage.</w:t>
+        <w:t>The literature reviewed has some clear weaknesses. Many Kenyan studies look at participation during planning or budgeting and simply assume that its benefits carry over into implementation (Malusha &amp; Njoroge, 2023; Mutua et al., 2024). That assumption is rarely tested. Several studies also rest on small samples or a single sector, such as water projects or health facilities, so it is hard to say whether their findings apply to the full range of a county's work (Katumo &amp; Odenyo, 2024; Maiyo &amp; Kinuthia, 2025). Research on mechanisms, meanwhile, tends to count attendance. It tells us who came to a forum but not whether the forum changed anything (Wambugu et al., 2024; Wasike et al., 2024). International studies go further into organisational and trust issues (Holum, 2023; Kurkela et al., 2024), but they come from countries with stronger institutions and far more resources than Kenyan counties. This study responds by combining a survey across sectors with interviews of officials, and by focusing squarely on implementation.</w:t>
       </w:r>
     </w:p>
     <w:p>
@@ -3679,7 +3679,7 @@
         <w:spacing w:lineRule="exact" w:line="360" w:before="240" w:after="120"/>
         <w:rPr/>
       </w:pPr>
-      <w:bookmarkStart w:id="35" w:name="__RefHeading___Toc1442_3754024237"/>
+      <w:bookmarkStart w:id="35" w:name="__RefHeading___Toc1442_1996925461"/>
       <w:bookmarkEnd w:id="35"/>
       <w:r>
         <w:rPr/>
@@ -3695,7 +3695,7 @@
       </w:pPr>
       <w:r>
         <w:rPr/>
-        <w:t>The literature shows broad agreement that public participation matters for governance and service delivery, but it also reveals that participation in Kenyan counties is often low, channelled through mechanisms of limited reach, and hindered by institutional, informational and economic barriers. Table 2.1 summarises the key studies reviewed and the gaps the present study intends to address.</w:t>
+        <w:t>The studies reviewed agree that public participation matters for governance and service delivery. They also show that participation in Kenyan counties is often low, that the channels used reach limited sections of the population, and that institutional, informational and economic barriers keep many residents out. Table 2.1 summarises the main studies and the gaps this study seeks to address.</w:t>
       </w:r>
     </w:p>
     <w:p>
@@ -4582,7 +4582,7 @@
         <w:jc w:val="center"/>
         <w:rPr/>
       </w:pPr>
-      <w:bookmarkStart w:id="36" w:name="__RefHeading___Toc1444_3754024237"/>
+      <w:bookmarkStart w:id="36" w:name="__RefHeading___Toc1444_1996925461"/>
       <w:bookmarkEnd w:id="36"/>
       <w:r>
         <w:rPr/>
@@ -4597,7 +4597,7 @@
         <w:spacing w:lineRule="exact" w:line="360" w:before="240" w:after="120"/>
         <w:rPr/>
       </w:pPr>
-      <w:bookmarkStart w:id="37" w:name="__RefHeading___Toc1446_3754024237"/>
+      <w:bookmarkStart w:id="37" w:name="__RefHeading___Toc1446_1996925461"/>
       <w:bookmarkEnd w:id="37"/>
       <w:r>
         <w:rPr/>
@@ -4613,7 +4613,7 @@
       </w:pPr>
       <w:r>
         <w:rPr/>
-        <w:t>This chapter describes the methodology that will be used to conduct the study. It covers the research design, location of the study, target population, sampling techniques and sample size, research instruments, pilot testing, validity and reliability, data collection procedures, data analysis and presentation, and ethical considerations.</w:t>
+        <w:t>This chapter explains how the study will be carried out. It describes the research design, study location, target population, sampling techniques and sample size, research instruments, pilot testing, validity and reliability, data collection procedures, data analysis and ethical considerations.</w:t>
       </w:r>
     </w:p>
     <w:p>
@@ -4622,7 +4622,7 @@
         <w:spacing w:lineRule="exact" w:line="360" w:before="240" w:after="120"/>
         <w:rPr/>
       </w:pPr>
-      <w:bookmarkStart w:id="38" w:name="__RefHeading___Toc1448_3754024237"/>
+      <w:bookmarkStart w:id="38" w:name="__RefHeading___Toc1448_1996925461"/>
       <w:bookmarkEnd w:id="38"/>
       <w:r>
         <w:rPr/>
@@ -4638,7 +4638,7 @@
       </w:pPr>
       <w:r>
         <w:rPr/>
-        <w:t>The study will adopt a descriptive cross-sectional survey design complemented by qualitative key informant interviews. A descriptive design is suitable where the researcher seeks to describe the characteristics of a population and the relationships among variables as they exist, without manipulating them (Creswell &amp; Creswell, 2023). The cross-sectional element means that data will be gathered at one point in time, which is practical given the time and resources available for the study. Combining a survey with interviews follows a convergent mixed-methods logic in which quantitative data measure the extent and correlates of participation, while qualitative data explain the patterns observed (Creswell &amp; Creswell, 2023). A similar approach was used successfully in comparable Kenyan studies (Maiyo &amp; Kinuthia, 2025; Mutua et al., 2024).</w:t>
+        <w:t>The study will use a descriptive cross-sectional survey design supported by key informant interviews. A descriptive design allows a researcher to describe a population and examine relationships between variables as they occur naturally, without manipulating anything (Creswell &amp; Creswell, 2023). Data will be collected at a single point in time, which suits the time and budget available. The survey will measure how much residents participate and how this relates to implementation. The interviews will help explain the patterns that emerge, in keeping with a convergent mixed-methods approach (Creswell &amp; Creswell, 2023). Similar designs have worked well in recent Kenyan studies on the subject (Maiyo &amp; Kinuthia, 2025; Mutua et al., 2024).</w:t>
       </w:r>
     </w:p>
     <w:p>
@@ -4647,7 +4647,7 @@
         <w:spacing w:lineRule="exact" w:line="360" w:before="240" w:after="120"/>
         <w:rPr/>
       </w:pPr>
-      <w:bookmarkStart w:id="39" w:name="__RefHeading___Toc1450_3754024237"/>
+      <w:bookmarkStart w:id="39" w:name="__RefHeading___Toc1450_1996925461"/>
       <w:bookmarkEnd w:id="39"/>
       <w:r>
         <w:rPr/>
@@ -4663,7 +4663,7 @@
       </w:pPr>
       <w:r>
         <w:rPr/>
-        <w:t>The study will be conducted in Machakos County, one of the 47 counties established under the Constitution of Kenya (2010). The county covers an area of about 6,000 square kilometres and borders Nairobi, Kiambu, Murang'a, Embu, Kitui, Makueni and Kajiado counties. It had a population of 1,421,932 at the 2019 census (KNBS, 2019). The county was chosen for three reasons. First, it combines urban, peri-urban and rural settings within a single administrative unit, allowing the study to capture varied participation experiences. Second, it has operated a range of participation structures since 2013, including ward forums, sector working groups and digital platforms (CGM, 2023). Third, earlier research in the county has documented a gap between legal requirements and actual participation (Mutua et al., 2024), making it a suitable site for examining the implementation stage. The study will focus on Machakos Town Sub-County (urban), Matungulu Sub-County (peri-urban) and Mwala Sub-County (rural).</w:t>
+        <w:t>The study will take place in Machakos County, one of the 47 counties created under the Constitution of Kenya (2010). Covering roughly 6,000 square kilometres, the county borders Nairobi, Kiambu, Murang'a, Embu, Kitui, Makueni and Kajiado. Its population stood at 1,421,932 in the 2019 census (KNBS, 2019). Machakos was chosen for several reasons. Within one county it combines busy towns, peri-urban settlements growing along the Nairobi corridor and dry rural areas, so residents' experiences of participation are likely to vary. The county has also used ward forums, sector working groups and digital platforms since 2013 (CGM, 2023), so there is an established system to study. In addition, earlier work in Matungulu has already pointed to a gap between what the law requires and what residents actually experience (Mutua et al., 2024). The study will focus on Machakos Town Sub-County (urban), Matungulu Sub-County (peri-urban) and Mwala Sub-County (rural).</w:t>
       </w:r>
     </w:p>
     <w:p>
@@ -4672,7 +4672,7 @@
         <w:spacing w:lineRule="exact" w:line="360" w:before="240" w:after="120"/>
         <w:rPr/>
       </w:pPr>
-      <w:bookmarkStart w:id="40" w:name="__RefHeading___Toc1452_3754024237"/>
+      <w:bookmarkStart w:id="40" w:name="__RefHeading___Toc1452_1996925461"/>
       <w:bookmarkEnd w:id="40"/>
       <w:r>
         <w:rPr/>
@@ -4688,7 +4688,7 @@
       </w:pPr>
       <w:r>
         <w:rPr/>
-        <w:t>The target population will consist of two groups. The first comprises residents of the three selected sub-counties, totalling 514,059 people according to the 2019 census (KNBS, 2019). The second comprises county officials directly involved in public participation and policy implementation, namely the three sub-county administrators, the 18 ward administrators in the selected sub-counties, and officers from the departments responsible for public participation and civic education, finance and economic planning, health, and water. Table 3.1 presents the distribution of the resident population.</w:t>
+        <w:t>The study targets two groups. The first is the residents of the three selected sub-counties, 514,059 people according to the 2019 census (KNBS, 2019). The second is county officials who work directly on public participation and policy implementation. These include the three sub-county administrators, the 18 ward administrators in the selected sub-counties, and officers from the departments responsible for public participation and civic education, finance and economic planning, health, and water. Table 3.1 shows how the resident population is distributed.</w:t>
       </w:r>
     </w:p>
     <w:p>
@@ -5331,7 +5331,7 @@
         <w:spacing w:lineRule="exact" w:line="360" w:before="240" w:after="120"/>
         <w:rPr/>
       </w:pPr>
-      <w:bookmarkStart w:id="41" w:name="__RefHeading___Toc1454_3754024237"/>
+      <w:bookmarkStart w:id="41" w:name="__RefHeading___Toc1454_1996925461"/>
       <w:bookmarkEnd w:id="41"/>
       <w:r>
         <w:rPr/>
@@ -5344,7 +5344,7 @@
         <w:spacing w:lineRule="exact" w:line="360" w:before="160" w:after="100"/>
         <w:rPr/>
       </w:pPr>
-      <w:bookmarkStart w:id="42" w:name="__RefHeading___Toc1456_3754024237"/>
+      <w:bookmarkStart w:id="42" w:name="__RefHeading___Toc1456_1996925461"/>
       <w:bookmarkEnd w:id="42"/>
       <w:r>
         <w:rPr/>
@@ -5360,7 +5360,7 @@
       </w:pPr>
       <w:r>
         <w:rPr/>
-        <w:t>The study will use multi-stage sampling. In the first stage, the three sub-counties will be selected purposively to represent urban, peri-urban and rural settings, since access to participation opportunities is likely to vary across these settings (Wambugu et al., 2024). In the second stage, the sample of residents will be allocated to each sub-county in proportion to its population. In the third stage, respondents will be selected through simple random sampling of households within each ward, using ward registers and village maps with the support of village administrators, and one adult will be interviewed per household. Key informants will be selected through purposive sampling because they hold specific knowledge about how participation is organised and how county policies are implemented (Saunders et al., 2023).</w:t>
+        <w:t>Sampling will be done in stages. The three sub-counties have been picked purposively to cover urban, peri-urban and rural settings, since access to participation opportunities is likely to differ across them (Wambugu et al., 2024). The resident sample will then be shared among the sub-counties in proportion to their populations. Within each ward, households will be selected by simple random sampling using ward registers and village maps, with help from village administrators, and one adult will be interviewed in each household. Key informants will be chosen purposively because of what they know about how participation is organised and how county policies are carried out (Saunders et al., 2023).</w:t>
       </w:r>
     </w:p>
     <w:p>
@@ -5369,7 +5369,7 @@
         <w:spacing w:lineRule="exact" w:line="360" w:before="160" w:after="100"/>
         <w:rPr/>
       </w:pPr>
-      <w:bookmarkStart w:id="43" w:name="__RefHeading___Toc1458_3754024237"/>
+      <w:bookmarkStart w:id="43" w:name="__RefHeading___Toc1458_1996925461"/>
       <w:bookmarkEnd w:id="43"/>
       <w:r>
         <w:rPr/>
@@ -5385,7 +5385,7 @@
       </w:pPr>
       <w:r>
         <w:rPr/>
-        <w:t>The sample size for residents will be determined using Yamane's (1967) formula for a finite population at a 95% confidence level and a margin of error of 5%:</w:t>
+        <w:t>The resident sample size will be calculated using Yamane's (1967) formula for a finite population, at a 95% confidence level and a 5% margin of error:</w:t>
       </w:r>
     </w:p>
     <w:p>
@@ -5412,7 +5412,7 @@
       </w:pPr>
       <w:r>
         <w:rPr/>
-        <w:t xml:space="preserve">where </w:t>
+        <w:t xml:space="preserve">Here </w:t>
       </w:r>
       <w:r>
         <w:rPr>
@@ -5445,7 +5445,7 @@
       </w:r>
       <w:r>
         <w:rPr/>
-        <w:t xml:space="preserve"> is the margin of error (0.05). Substituting the values gives n = 514,059 / (1 + 514,059 × 0.0025) = 399.7, which is rounded to 400 respondents. Table 3.2 shows the proportionate distribution of the sample, and Table 3.3 shows the key informants.</w:t>
+        <w:t xml:space="preserve"> is the margin of error (0.05). This gives n = 514,059 / (1 + 514,059 × 0.0025) = 399.7, rounded to 400 respondents. Table 3.2 shows how the sample is spread across the sub-counties, and Table 3.3 lists the key informants.</w:t>
       </w:r>
     </w:p>
     <w:p>
@@ -6589,7 +6589,7 @@
       </w:pPr>
       <w:r>
         <w:rPr/>
-        <w:t>The total sample for the study will therefore be 429 respondents, comprising 400 residents and 29 key informants.</w:t>
+        <w:t>In total, 429 people will take part in the study: 400 residents and 29 key informants.</w:t>
       </w:r>
     </w:p>
     <w:p>
@@ -6598,7 +6598,7 @@
         <w:spacing w:lineRule="exact" w:line="360" w:before="240" w:after="120"/>
         <w:rPr/>
       </w:pPr>
-      <w:bookmarkStart w:id="44" w:name="__RefHeading___Toc1460_3754024237"/>
+      <w:bookmarkStart w:id="44" w:name="__RefHeading___Toc1460_1996925461"/>
       <w:bookmarkEnd w:id="44"/>
       <w:r>
         <w:rPr/>
@@ -6614,7 +6614,7 @@
       </w:pPr>
       <w:r>
         <w:rPr/>
-        <w:t>Two instruments will be used. A structured questionnaire will be administered to residents. It will have five sections: demographic information; extent of participation; participation mechanisms; challenges to participation; and effectiveness of policy implementation. Most items will be presented on a five-point Likert scale ranging from 1 (strongly disagree) to 5 (strongly agree), with a few open-ended items to capture views not anticipated by the researcher. The questionnaire will be translated into Kiswahili and Kikamba and back-translated to English to ensure that meaning is preserved. A semi-structured interview guide will be used with key informants to explore how participation is organised, how citizen input is used during implementation, and what constraints the county faces. Relevant county documents, such as annual development plans, budget implementation reports and public participation reports, will also be reviewed to support triangulation.</w:t>
+        <w:t>Two instruments will be used. Residents will complete a structured questionnaire in five parts: background information, extent of participation, participation mechanisms, challenges to participation and effectiveness of policy implementation. Most items use a five-point Likert scale from 1 (strongly disagree) to 5 (strongly agree), and a few open questions give respondents room to raise issues the researcher may not have anticipated. The questionnaire will be translated into Kiswahili and Kikamba and then translated back into English to confirm that the meaning has not shifted. Key informants will be interviewed using a semi-structured guide covering how participation is organised, how residents' input is used during implementation and what constraints the county faces. County documents, including annual development plans, budget implementation reports and public participation reports, will also be reviewed so that findings can be cross-checked.</w:t>
       </w:r>
     </w:p>
     <w:p>
@@ -7263,7 +7263,7 @@
         <w:spacing w:lineRule="exact" w:line="360" w:before="240" w:after="120"/>
         <w:rPr/>
       </w:pPr>
-      <w:bookmarkStart w:id="45" w:name="__RefHeading___Toc1462_3754024237"/>
+      <w:bookmarkStart w:id="45" w:name="__RefHeading___Toc1462_1996925461"/>
       <w:bookmarkEnd w:id="45"/>
       <w:r>
         <w:rPr/>
@@ -7279,7 +7279,7 @@
       </w:pPr>
       <w:r>
         <w:rPr/>
-        <w:t>The instruments will be pre-tested in Kathiani Sub-County, which shares many characteristics with the study area but will not form part of the main sample. The pilot will involve 40 residents, representing 10% of the main sample, and three key informants. The pilot will help identify unclear or ambiguous items, estimate the time needed to complete the questionnaire, and test the reliability of the scales. Items found to be problematic will be revised before the main data collection.</w:t>
+        <w:t>Before the main study, the instruments will be tried out in Kathiani Sub-County, which is similar to the study area but will not be part of the main sample. The pilot will involve 40 residents, equal to 10% of the main sample, and three key informants. It will show which questions are unclear, how long the questionnaire takes, and whether the scales are reliable. Any items that cause difficulty will be revised before the main fieldwork.</w:t>
       </w:r>
     </w:p>
     <w:p>
@@ -7288,7 +7288,7 @@
         <w:spacing w:lineRule="exact" w:line="360" w:before="160" w:after="100"/>
         <w:rPr/>
       </w:pPr>
-      <w:bookmarkStart w:id="46" w:name="__RefHeading___Toc1464_3754024237"/>
+      <w:bookmarkStart w:id="46" w:name="__RefHeading___Toc1464_1996925461"/>
       <w:bookmarkEnd w:id="46"/>
       <w:r>
         <w:rPr/>
@@ -7304,7 +7304,7 @@
       </w:pPr>
       <w:r>
         <w:rPr/>
-        <w:t>Validity refers to the degree to which an instrument measures what it is intended to measure (Saunders et al., 2023). Content validity will be established by aligning each item with the study objectives and the conceptual framework, and by subjecting the instruments to review by the university supervisors and two experts in public administration. The experts will rate the relevance of each item, and a Content Validity Index (CVI) will be computed; a CVI of 0.80 or higher will be considered acceptable. Face validity will be enhanced through the pilot study.</w:t>
+        <w:t>Validity is the extent to which an instrument measures what it is meant to measure (Saunders et al., 2023). To establish content validity, every item will be matched to a study objective and to the conceptual framework. The university supervisors and two experts in public administration will then review the instruments and rate how relevant each item is. From their ratings a Content Validity Index (CVI) will be calculated, and a value of 0.80 or higher will be taken as acceptable. The pilot study will help to confirm face validity.</w:t>
       </w:r>
     </w:p>
     <w:p>
@@ -7313,7 +7313,7 @@
         <w:spacing w:lineRule="exact" w:line="360" w:before="160" w:after="100"/>
         <w:rPr/>
       </w:pPr>
-      <w:bookmarkStart w:id="47" w:name="__RefHeading___Toc1466_3754024237"/>
+      <w:bookmarkStart w:id="47" w:name="__RefHeading___Toc1466_1996925461"/>
       <w:bookmarkEnd w:id="47"/>
       <w:r>
         <w:rPr/>
@@ -7329,7 +7329,7 @@
       </w:pPr>
       <w:r>
         <w:rPr/>
-        <w:t>Reliability is the consistency with which an instrument produces similar results under similar conditions (Creswell &amp; Creswell, 2023). The internal consistency of the Likert-scale items will be tested using Cronbach's alpha on the pilot data. A coefficient of 0.70 or above for each construct will be considered acceptable; items that reduce the coefficient below this threshold will be reviewed or removed. For the qualitative component, credibility and dependability will be enhanced through triangulation with documents, careful note-taking, audio recording with consent, and an audit trail of analytical decisions (Braun &amp; Clarke, 2022).</w:t>
+        <w:t>Reliability refers to whether an instrument gives consistent results under similar conditions (Creswell &amp; Creswell, 2023). Cronbach's alpha will be calculated from the pilot data to check the internal consistency of each Likert scale. A coefficient of 0.70 or above will be accepted, and any item that pulls a scale below this level will be revised or dropped. For the interviews, trustworthiness will be supported by cross-checking against documents, keeping careful notes, recording interviews where consent is given, and keeping a record of analytical decisions (Braun &amp; Clarke, 2022).</w:t>
       </w:r>
     </w:p>
     <w:p>
@@ -7338,7 +7338,7 @@
         <w:spacing w:lineRule="exact" w:line="360" w:before="240" w:after="120"/>
         <w:rPr/>
       </w:pPr>
-      <w:bookmarkStart w:id="48" w:name="__RefHeading___Toc1468_3754024237"/>
+      <w:bookmarkStart w:id="48" w:name="__RefHeading___Toc1468_1996925461"/>
       <w:bookmarkEnd w:id="48"/>
       <w:r>
         <w:rPr/>
@@ -7354,7 +7354,7 @@
       </w:pPr>
       <w:r>
         <w:rPr/>
-        <w:t>After approval of the proposal, the researcher will obtain an introduction letter from Mount Kenya University, ethical clearance from the university's ethics review committee, and a research permit from the National Commission for Science, Technology and Innovation (NACOSTI). Authority will also be sought from the Machakos County Government and the County Commissioner. Six research assistants, recruited from the study area and fluent in Kikamba and Kiswahili, will be trained for two days on the instruments, sampling procedures and research ethics. Questionnaires will be administered face to face, with assistants reading items to respondents who prefer this. The researcher will personally conduct all key informant interviews at times convenient to the officials. Completed questionnaires will be checked daily for completeness and consistency.</w:t>
+        <w:t>Once the proposal is approved, the researcher will obtain an introduction letter from Mount Kenya University, ethical clearance from the university's ethics review committee and a research permit from the National Commission for Science, Technology and Innovation (NACOSTI). Permission will also be sought from the Machakos County Government and the County Commissioner. Six research assistants from the study area who speak Kikamba and Kiswahili will receive two days of training on the instruments, sampling and research ethics. They will administer the questionnaires face to face and read the questions aloud for respondents who prefer it. The researcher will conduct all key informant interviews in person, at times that suit the officials. Completed questionnaires will be checked each evening for missing or inconsistent answers.</w:t>
       </w:r>
     </w:p>
     <w:p>
@@ -7363,7 +7363,7 @@
         <w:spacing w:lineRule="exact" w:line="360" w:before="240" w:after="120"/>
         <w:rPr/>
       </w:pPr>
-      <w:bookmarkStart w:id="49" w:name="__RefHeading___Toc1470_3754024237"/>
+      <w:bookmarkStart w:id="49" w:name="__RefHeading___Toc1470_1996925461"/>
       <w:bookmarkEnd w:id="49"/>
       <w:r>
         <w:rPr/>
@@ -7379,7 +7379,7 @@
       </w:pPr>
       <w:r>
         <w:rPr/>
-        <w:t>Quantitative data will be cleaned, coded and entered into the Statistical Package for the Social Sciences (SPSS) version 29. Descriptive statistics, including frequencies, percentages, means and standard deviations, will be used to address the first three objectives. For the fourth objective, Pearson's product-moment correlation will be used to establish the strength and direction of the relationship between public participation and the effectiveness of policy implementation. Simple linear regression will then be used to test the null hypothesis, based on the following model:</w:t>
+        <w:t>Quantitative data will be cleaned, coded and entered into the Statistical Package for the Social Sciences (SPSS) version 29. The first three objectives will be addressed using descriptive statistics: frequencies, percentages, means and standard deviations. For the fourth objective, Pearson's correlation will show the strength and direction of the relationship between public participation and implementation effectiveness, and simple linear regression will then be used to test the null hypothesis with the following model:</w:t>
       </w:r>
     </w:p>
     <w:p>
@@ -7406,7 +7406,7 @@
       </w:pPr>
       <w:r>
         <w:rPr/>
-        <w:t xml:space="preserve">where </w:t>
+        <w:t xml:space="preserve">In this model, </w:t>
       </w:r>
       <w:r>
         <w:rPr>
@@ -7450,7 +7450,7 @@
       </w:r>
       <w:r>
         <w:rPr/>
-        <w:t xml:space="preserve"> is the composite public participation index, and </w:t>
+        <w:t xml:space="preserve"> is the composite public participation index and </w:t>
       </w:r>
       <w:r>
         <w:rPr>
@@ -7461,7 +7461,7 @@
       </w:r>
       <w:r>
         <w:rPr/>
-        <w:t xml:space="preserve"> is the error term. To estimate the relative contribution of each dimension, a supplementary multiple regression model will be fitted:</w:t>
+        <w:t xml:space="preserve"> is the error term. To see how much each dimension contributes on its own, a supplementary multiple regression model will also be fitted:</w:t>
       </w:r>
     </w:p>
     <w:p>
@@ -7488,7 +7488,7 @@
       </w:pPr>
       <w:r>
         <w:rPr/>
-        <w:t xml:space="preserve">where </w:t>
+        <w:t xml:space="preserve">Here </w:t>
       </w:r>
       <w:r>
         <w:rPr>
@@ -7521,7 +7521,7 @@
       </w:r>
       <w:r>
         <w:rPr/>
-        <w:t xml:space="preserve"> is the severity of barriers to participation. Before the regression is run, the assumptions of normality, linearity, homoscedasticity and absence of multicollinearity will be tested. The null hypothesis will be rejected if the p-value is less than 0.05. Qualitative data from interviews and open-ended items will be transcribed, coded and analysed thematically following the six-phase approach described by Braun and Clarke (2022). Findings will be presented in tables, figures and narrative form, with direct quotations used to illustrate key themes.</w:t>
+        <w:t xml:space="preserve"> is the severity of barriers to participation. Before running the regressions, the researcher will check the assumptions of normality, linearity, homoscedasticity and absence of multicollinearity. The null hypothesis will be rejected if the p-value is below 0.05. Interview recordings and answers to open-ended questions will be transcribed, coded and analysed thematically using the six phases set out by Braun and Clarke (2022). Results will be presented in tables, figures and narrative, with direct quotations used to bring out the main themes.</w:t>
       </w:r>
     </w:p>
     <w:p>
@@ -7530,7 +7530,7 @@
         <w:spacing w:lineRule="exact" w:line="360" w:before="240" w:after="120"/>
         <w:rPr/>
       </w:pPr>
-      <w:bookmarkStart w:id="50" w:name="__RefHeading___Toc1472_3754024237"/>
+      <w:bookmarkStart w:id="50" w:name="__RefHeading___Toc1472_1996925461"/>
       <w:bookmarkEnd w:id="50"/>
       <w:r>
         <w:rPr/>
@@ -7546,7 +7546,7 @@
       </w:pPr>
       <w:r>
         <w:rPr/>
-        <w:t>The study will observe the ethical standards required of research involving human participants. Ethical approval will be obtained from the Mount Kenya University ethics review committee, and a research permit will be obtained from NACOSTI. Participation will be voluntary, and informed consent will be sought from every respondent after the purpose, procedures, risks and benefits of the study have been explained. Respondents will be free to decline any question or to withdraw at any stage without penalty. No names or identifying details will be recorded on questionnaires, and interview transcripts will be anonymised using codes. Data will be stored in password-protected files accessible only to the researcher and supervisors, and will be used solely for academic purposes. All sources consulted will be properly acknowledged to avoid plagiarism, and the findings will be shared with the Machakos County Government and participating communities in an accessible summary.</w:t>
+        <w:t>The study will follow accepted ethical standards for research with human participants. Approval will be obtained from the Mount Kenya University ethics review committee, and a research permit from NACOSTI. Taking part will be voluntary. Each respondent will have the purpose, procedures, risks and benefits of the study explained before being asked for informed consent, and anyone may skip a question or withdraw at any point without penalty. Questionnaires will carry no names or identifying details, and interview transcripts will use codes in place of names. Data will be kept in password-protected files that only the researcher and supervisors can open, and will be used for academic purposes alone. All sources will be properly acknowledged. A short, plain-language summary of the findings will be shared with the county government and the communities that took part.</w:t>
       </w:r>
       <w:r>
         <w:br w:type="page"/>
@@ -7559,7 +7559,7 @@
         <w:jc w:val="center"/>
         <w:rPr/>
       </w:pPr>
-      <w:bookmarkStart w:id="51" w:name="__RefHeading___Toc1474_3754024237"/>
+      <w:bookmarkStart w:id="51" w:name="__RefHeading___Toc1474_1996925461"/>
       <w:bookmarkEnd w:id="51"/>
       <w:r>
         <w:rPr/>
@@ -8335,7 +8335,7 @@
         <w:jc w:val="center"/>
         <w:rPr/>
       </w:pPr>
-      <w:bookmarkStart w:id="52" w:name="__RefHeading___Toc1476_3754024237"/>
+      <w:bookmarkStart w:id="52" w:name="__RefHeading___Toc1476_1996925461"/>
       <w:bookmarkEnd w:id="52"/>
       <w:r>
         <w:rPr/>
@@ -8348,7 +8348,7 @@
         <w:spacing w:lineRule="exact" w:line="360" w:before="240" w:after="120"/>
         <w:rPr/>
       </w:pPr>
-      <w:bookmarkStart w:id="53" w:name="__RefHeading___Toc1478_3754024237"/>
+      <w:bookmarkStart w:id="53" w:name="__RefHeading___Toc1478_1996925461"/>
       <w:bookmarkEnd w:id="53"/>
       <w:r>
         <w:rPr/>
@@ -8472,7 +8472,7 @@
         <w:spacing w:lineRule="exact" w:line="360" w:before="0" w:after="120"/>
         <w:rPr/>
       </w:pPr>
-      <w:bookmarkStart w:id="54" w:name="__RefHeading___Toc1480_3754024237"/>
+      <w:bookmarkStart w:id="54" w:name="__RefHeading___Toc1480_1996925461"/>
       <w:bookmarkEnd w:id="54"/>
       <w:r>
         <w:rPr/>
@@ -8533,7 +8533,7 @@
         <w:spacing w:lineRule="exact" w:line="360" w:before="0" w:after="120"/>
         <w:rPr/>
       </w:pPr>
-      <w:bookmarkStart w:id="55" w:name="__RefHeading___Toc1482_3754024237"/>
+      <w:bookmarkStart w:id="55" w:name="__RefHeading___Toc1482_1996925461"/>
       <w:bookmarkEnd w:id="55"/>
       <w:r>
         <w:rPr/>
@@ -8561,7 +8561,7 @@
         <w:spacing w:lineRule="exact" w:line="360" w:before="160" w:after="100"/>
         <w:rPr/>
       </w:pPr>
-      <w:bookmarkStart w:id="56" w:name="__RefHeading___Toc1484_3754024237"/>
+      <w:bookmarkStart w:id="56" w:name="__RefHeading___Toc1484_1996925461"/>
       <w:bookmarkEnd w:id="56"/>
       <w:r>
         <w:rPr/>
@@ -8646,7 +8646,7 @@
         <w:spacing w:lineRule="exact" w:line="360" w:before="160" w:after="100"/>
         <w:rPr/>
       </w:pPr>
-      <w:bookmarkStart w:id="57" w:name="__RefHeading___Toc1486_3754024237"/>
+      <w:bookmarkStart w:id="57" w:name="__RefHeading___Toc1486_1996925461"/>
       <w:bookmarkEnd w:id="57"/>
       <w:r>
         <w:rPr/>
@@ -9941,7 +9941,7 @@
         <w:spacing w:lineRule="exact" w:line="360" w:before="160" w:after="100"/>
         <w:rPr/>
       </w:pPr>
-      <w:bookmarkStart w:id="58" w:name="__RefHeading___Toc1488_3754024237"/>
+      <w:bookmarkStart w:id="58" w:name="__RefHeading___Toc1488_1996925461"/>
       <w:bookmarkEnd w:id="58"/>
       <w:r>
         <w:rPr/>
@@ -11236,7 +11236,7 @@
         <w:spacing w:lineRule="exact" w:line="360" w:before="160" w:after="100"/>
         <w:rPr/>
       </w:pPr>
-      <w:bookmarkStart w:id="59" w:name="__RefHeading___Toc1490_3754024237"/>
+      <w:bookmarkStart w:id="59" w:name="__RefHeading___Toc1490_1996925461"/>
       <w:bookmarkEnd w:id="59"/>
       <w:r>
         <w:rPr/>
@@ -12531,7 +12531,7 @@
         <w:spacing w:lineRule="exact" w:line="360" w:before="160" w:after="100"/>
         <w:rPr/>
       </w:pPr>
-      <w:bookmarkStart w:id="60" w:name="__RefHeading___Toc1492_3754024237"/>
+      <w:bookmarkStart w:id="60" w:name="__RefHeading___Toc1492_1996925461"/>
       <w:bookmarkEnd w:id="60"/>
       <w:r>
         <w:rPr/>
@@ -13826,7 +13826,7 @@
         <w:spacing w:lineRule="exact" w:line="360" w:before="160" w:after="100"/>
         <w:rPr/>
       </w:pPr>
-      <w:bookmarkStart w:id="61" w:name="__RefHeading___Toc1494_3754024237"/>
+      <w:bookmarkStart w:id="61" w:name="__RefHeading___Toc1494_1996925461"/>
       <w:bookmarkEnd w:id="61"/>
       <w:r>
         <w:rPr/>
@@ -13914,7 +13914,7 @@
         <w:spacing w:lineRule="exact" w:line="360" w:before="0" w:after="120"/>
         <w:rPr/>
       </w:pPr>
-      <w:bookmarkStart w:id="62" w:name="__RefHeading___Toc1496_3754024237"/>
+      <w:bookmarkStart w:id="62" w:name="__RefHeading___Toc1496_1996925461"/>
       <w:bookmarkEnd w:id="62"/>
       <w:r>
         <w:rPr/>
@@ -14062,7 +14062,7 @@
         <w:spacing w:lineRule="exact" w:line="360" w:before="0" w:after="120"/>
         <w:rPr/>
       </w:pPr>
-      <w:bookmarkStart w:id="63" w:name="__RefHeading___Toc1498_3754024237"/>
+      <w:bookmarkStart w:id="63" w:name="__RefHeading___Toc1498_1996925461"/>
       <w:bookmarkEnd w:id="63"/>
       <w:r>
         <w:rPr/>
@@ -14654,7 +14654,7 @@
         <w:spacing w:lineRule="exact" w:line="360" w:before="240" w:after="120"/>
         <w:rPr/>
       </w:pPr>
-      <w:bookmarkStart w:id="64" w:name="__RefHeading___Toc1500_3754024237"/>
+      <w:bookmarkStart w:id="64" w:name="__RefHeading___Toc1500_1996925461"/>
       <w:bookmarkEnd w:id="64"/>
       <w:r>
         <w:rPr/>
@@ -15572,7 +15572,7 @@
     </w:r>
     <w:r>
       <w:rPr/>
-      <w:t>30</w:t>
+      <w:t>29</w:t>
     </w:r>
     <w:r>
       <w:rPr/>

</xml_diff>